<commit_message>
day 16: tao hop dong file word thanh cong, them, sua, xoa nhan vien, can ho, export, import excel thanh cong
</commit_message>
<xml_diff>
--- a/assets/templates/hd_mua_ch.docx
+++ b/assets/templates/hd_mua_ch.docx
@@ -5,12 +5,16 @@
     <w:p>
       <w:pPr>
         <w:jc w:val="center"/>
+        <w:rPr>
+          <w:color w:val="000000" w:themeColor="text1"/>
+        </w:rPr>
       </w:pPr>
       <w:bookmarkStart w:id="0" w:name="_Hlk197211242"/>
       <w:r>
         <w:rPr>
           <w:b/>
           <w:bCs/>
+          <w:color w:val="000000" w:themeColor="text1"/>
         </w:rPr>
         <w:t>CỘNG HÒA XÃ HỘI CHỦ NGHĨA VIỆT NAM</w:t>
       </w:r>
@@ -18,11 +22,15 @@
     <w:p>
       <w:pPr>
         <w:jc w:val="center"/>
+        <w:rPr>
+          <w:color w:val="000000" w:themeColor="text1"/>
+        </w:rPr>
       </w:pPr>
       <w:r>
         <w:rPr>
           <w:b/>
           <w:bCs/>
+          <w:color w:val="000000" w:themeColor="text1"/>
         </w:rPr>
         <w:t>Độc lập - Tự do - Hạnh phúc</w:t>
       </w:r>
@@ -30,32 +38,42 @@
     <w:p>
       <w:pPr>
         <w:jc w:val="center"/>
+        <w:rPr>
+          <w:color w:val="000000" w:themeColor="text1"/>
+        </w:rPr>
       </w:pPr>
       <w:r>
         <w:rPr>
           <w:b/>
           <w:bCs/>
+          <w:color w:val="000000" w:themeColor="text1"/>
         </w:rPr>
         <w:t>--------------</w:t>
       </w:r>
     </w:p>
     <w:p>
       <w:pPr>
-        <w:ind w:left="2880"/>
-      </w:pPr>
-      <w:r>
-        <w:t>Hà Nội,</w:t>
-      </w:r>
-      <w:r>
-        <w:t xml:space="preserve"> </w:t>
+        <w:ind w:left="4320" w:firstLine="720"/>
+        <w:rPr>
+          <w:color w:val="000000" w:themeColor="text1"/>
+        </w:rPr>
+      </w:pPr>
+      <w:r>
+        <w:rPr>
+          <w:color w:val="000000" w:themeColor="text1"/>
+        </w:rPr>
+        <w:t xml:space="preserve">Hà Nội, </w:t>
       </w:r>
       <w:sdt>
         <w:sdtPr>
+          <w:rPr>
+            <w:color w:val="000000" w:themeColor="text1"/>
+          </w:rPr>
           <w:alias w:val="start_date"/>
           <w:tag w:val="text"/>
-          <w:id w:val="899177598"/>
+          <w:id w:val="-609747088"/>
           <w:placeholder>
-            <w:docPart w:val="6D91F724CE09413C8E74B0808D21A35C"/>
+            <w:docPart w:val="8B35AED859F9414BAE695BDF0831BDBE"/>
           </w:placeholder>
           <w:showingPlcHdr/>
           <w:text/>
@@ -64,6 +82,7 @@
           <w:r>
             <w:rPr>
               <w:rStyle w:val="PlaceholderText"/>
+              <w:color w:val="000000" w:themeColor="text1"/>
             </w:rPr>
             <w:t>Click or tap here to enter text.</w:t>
           </w:r>
@@ -76,6 +95,7 @@
         <w:rPr>
           <w:b/>
           <w:bCs/>
+          <w:color w:val="000000" w:themeColor="text1"/>
           <w:sz w:val="32"/>
           <w:szCs w:val="32"/>
         </w:rPr>
@@ -84,236 +104,270 @@
         <w:rPr>
           <w:b/>
           <w:bCs/>
+          <w:color w:val="000000" w:themeColor="text1"/>
           <w:sz w:val="32"/>
           <w:szCs w:val="32"/>
         </w:rPr>
-        <w:t xml:space="preserve">HỢP ĐỒNG </w:t>
-      </w:r>
+        <w:t>HỢP ĐỒNG MUA CĂN HỘ CHUNG CƯ</w:t>
+      </w:r>
+    </w:p>
+    <w:p>
+      <w:pPr>
+        <w:tabs>
+          <w:tab w:val="center" w:pos="4678"/>
+        </w:tabs>
+        <w:rPr>
+          <w:color w:val="000000" w:themeColor="text1"/>
+        </w:rPr>
+      </w:pPr>
+      <w:r>
+        <w:rPr>
+          <w:color w:val="000000" w:themeColor="text1"/>
+        </w:rPr>
+        <w:t>Số: ..... / .....</w:t>
+      </w:r>
+      <w:r>
+        <w:rPr>
+          <w:color w:val="000000" w:themeColor="text1"/>
+        </w:rPr>
+        <w:tab/>
+      </w:r>
+    </w:p>
+    <w:p>
+      <w:pPr>
+        <w:rPr>
+          <w:color w:val="000000" w:themeColor="text1"/>
+        </w:rPr>
+      </w:pPr>
+      <w:r>
+        <w:rPr>
+          <w:color w:val="000000" w:themeColor="text1"/>
+        </w:rPr>
+        <w:t>Căn cứ Bộ luật Dân sự số 91/2015/QH13 do Quốc hội nước Cộng hòa xã hội chủ nghĩa Việt Nam ban hành có hiệu lực năm 2015;</w:t>
+      </w:r>
+    </w:p>
+    <w:p>
+      <w:pPr>
+        <w:rPr>
+          <w:color w:val="000000" w:themeColor="text1"/>
+        </w:rPr>
+      </w:pPr>
+      <w:r>
+        <w:rPr>
+          <w:color w:val="000000" w:themeColor="text1"/>
+        </w:rPr>
+        <w:t>Căn cứ Luật Kinh doanh bất động sản số 66/2014/QH13 do Quốc hội nước Cộng hòa xã hội chủ nghĩa Việt Nam ban hành có hiệu lực năm 2015;</w:t>
+      </w:r>
+    </w:p>
+    <w:p>
+      <w:pPr>
+        <w:rPr>
+          <w:color w:val="000000" w:themeColor="text1"/>
+        </w:rPr>
+      </w:pPr>
+      <w:r>
+        <w:rPr>
+          <w:color w:val="000000" w:themeColor="text1"/>
+        </w:rPr>
+        <w:t>Căn cứ Luật Nhà ở số 65/2014/QH13 do Quốc hội nước Cộng hòa xã hội chủ nghĩa Việt Nam ban hành có hiệu lực năm 2015; </w:t>
+      </w:r>
+    </w:p>
+    <w:p>
+      <w:pPr>
+        <w:rPr>
+          <w:color w:val="000000" w:themeColor="text1"/>
+        </w:rPr>
+      </w:pPr>
+      <w:r>
+        <w:rPr>
+          <w:color w:val="000000" w:themeColor="text1"/>
+        </w:rPr>
+        <w:t>Căn cứ Nghị định số .../ .../ NĐ-CP ngày ... tháng ... năm ... của Chính phủ quy định chi tiết thi hành một số điều của Luật Kinh doanh bất động sản;</w:t>
+      </w:r>
+    </w:p>
+    <w:p>
+      <w:pPr>
+        <w:rPr>
+          <w:color w:val="000000" w:themeColor="text1"/>
+        </w:rPr>
+      </w:pPr>
+      <w:r>
+        <w:rPr>
+          <w:color w:val="000000" w:themeColor="text1"/>
+        </w:rPr>
+        <w:t>Căn cứ Nghị định số .../ .../ NĐ-CP ngày ... tháng ... năm ... của Chính phủ quy định chi tiết thi hành một số điều của Luật Nhà ở;</w:t>
+      </w:r>
+    </w:p>
+    <w:p>
+      <w:pPr>
+        <w:rPr>
+          <w:color w:val="000000" w:themeColor="text1"/>
+        </w:rPr>
+      </w:pPr>
+      <w:r>
+        <w:rPr>
+          <w:color w:val="000000" w:themeColor="text1"/>
+        </w:rPr>
+        <w:t>Căn cứ khác ............................................................................................................. </w:t>
+      </w:r>
+    </w:p>
+    <w:p>
+      <w:pPr>
+        <w:rPr>
+          <w:color w:val="000000" w:themeColor="text1"/>
+        </w:rPr>
+      </w:pPr>
+      <w:r>
+        <w:rPr>
+          <w:color w:val="000000" w:themeColor="text1"/>
+        </w:rPr>
+        <w:t>Căn cứ các văn bản, hồ sơ pháp lý dự án, căn hộ chung cư: ................................... </w:t>
+      </w:r>
+    </w:p>
+    <w:p>
+      <w:pPr>
+        <w:rPr>
+          <w:color w:val="000000" w:themeColor="text1"/>
+        </w:rPr>
+      </w:pPr>
+      <w:r>
+        <w:rPr>
+          <w:color w:val="000000" w:themeColor="text1"/>
+        </w:rPr>
+        <w:t>Các bên dưới đây gồm: </w:t>
+      </w:r>
+    </w:p>
+    <w:p>
+      <w:pPr>
+        <w:rPr>
+          <w:color w:val="000000" w:themeColor="text1"/>
+        </w:rPr>
+      </w:pPr>
       <w:r>
         <w:rPr>
           <w:b/>
           <w:bCs/>
-          <w:sz w:val="32"/>
-          <w:szCs w:val="32"/>
-        </w:rPr>
-        <w:t xml:space="preserve">MUA </w:t>
-      </w:r>
+          <w:color w:val="000000" w:themeColor="text1"/>
+        </w:rPr>
+        <w:t>I. BÊN BÁN CĂN HỘ (BÊN A):</w:t>
+      </w:r>
+    </w:p>
+    <w:p>
+      <w:pPr>
+        <w:rPr>
+          <w:color w:val="000000" w:themeColor="text1"/>
+        </w:rPr>
+      </w:pPr>
+      <w:r>
+        <w:rPr>
+          <w:color w:val="000000" w:themeColor="text1"/>
+        </w:rPr>
+        <w:t>- Tên tổ chức: Quản lí căn hộ chung cư </w:t>
+      </w:r>
+    </w:p>
+    <w:p>
+      <w:pPr>
+        <w:rPr>
+          <w:color w:val="000000" w:themeColor="text1"/>
+        </w:rPr>
+      </w:pPr>
+      <w:r>
+        <w:rPr>
+          <w:color w:val="000000" w:themeColor="text1"/>
+        </w:rPr>
+        <w:t xml:space="preserve">- Người đại diện theo pháp luật: Huỳnh Nhật Minh  </w:t>
+      </w:r>
+    </w:p>
+    <w:p>
+      <w:pPr>
+        <w:rPr>
+          <w:color w:val="000000" w:themeColor="text1"/>
+        </w:rPr>
+      </w:pPr>
+      <w:r>
+        <w:rPr>
+          <w:color w:val="000000" w:themeColor="text1"/>
+        </w:rPr>
+        <w:t>- Chức vụ: Trưởng ban quản lí</w:t>
+      </w:r>
+    </w:p>
+    <w:p>
+      <w:pPr>
+        <w:rPr>
+          <w:color w:val="000000" w:themeColor="text1"/>
+        </w:rPr>
+      </w:pPr>
+      <w:r>
+        <w:rPr>
+          <w:color w:val="000000" w:themeColor="text1"/>
+        </w:rPr>
+        <w:lastRenderedPageBreak/>
+        <w:t>- Địa chỉ: Hà Đông, Hà Nội </w:t>
+      </w:r>
+    </w:p>
+    <w:p>
+      <w:pPr>
+        <w:rPr>
+          <w:color w:val="000000" w:themeColor="text1"/>
+        </w:rPr>
+      </w:pPr>
+      <w:r>
+        <w:rPr>
+          <w:color w:val="000000" w:themeColor="text1"/>
+        </w:rPr>
+        <w:t>- Điện thoại liên hệ: 0987654321</w:t>
+      </w:r>
+    </w:p>
+    <w:p>
+      <w:pPr>
+        <w:rPr>
+          <w:color w:val="000000" w:themeColor="text1"/>
+        </w:rPr>
+      </w:pPr>
+      <w:r>
+        <w:rPr>
+          <w:color w:val="000000" w:themeColor="text1"/>
+        </w:rPr>
+        <w:t>- Mã số thuế: ...........................................................................................…………</w:t>
+      </w:r>
+    </w:p>
+    <w:p>
+      <w:pPr>
+        <w:rPr>
+          <w:color w:val="000000" w:themeColor="text1"/>
+        </w:rPr>
+      </w:pPr>
       <w:r>
         <w:rPr>
           <w:b/>
           <w:bCs/>
-          <w:sz w:val="32"/>
-          <w:szCs w:val="32"/>
-        </w:rPr>
-        <w:t>CĂN HỘ CHUNG CƯ</w:t>
-      </w:r>
-    </w:p>
-    <w:p>
-      <w:r>
-        <w:t>Số: ...</w:t>
-      </w:r>
-      <w:r>
-        <w:t>..</w:t>
-      </w:r>
-      <w:r>
-        <w:t xml:space="preserve"> / </w:t>
-      </w:r>
-      <w:r>
-        <w:t>..</w:t>
-      </w:r>
-      <w:r>
-        <w:t>...</w:t>
-      </w:r>
-    </w:p>
-    <w:p>
-      <w:r>
-        <w:t>Căn cứ Bộ luật Dân sự số 91/2015/QH13 do Quốc hội nước Cộng hòa xã hội chủ nghĩa Việt Nam ban hành có hiệu lực năm 2015;</w:t>
-      </w:r>
-    </w:p>
-    <w:p>
-      <w:r>
-        <w:t>Căn cứ Luật Kinh doanh bất động sản số 66/2014/QH13 do Quốc hội nước Cộng hòa xã hội chủ nghĩa Việt Nam ban hành có hiệu lực năm 2015;</w:t>
-      </w:r>
-    </w:p>
-    <w:p>
-      <w:r>
-        <w:t>Căn cứ Luật Nhà ở số 65/2014/QH13 do Quốc hội nước Cộng hòa xã hội chủ nghĩa Việt Nam ban hành có hiệu lực năm 2015; </w:t>
-      </w:r>
-    </w:p>
-    <w:p>
-      <w:r>
-        <w:t>Căn cứ Nghị định số .../ .../ NĐ-CP ngày ... tháng ... năm ... của Chính phủ quy định chi tiết thi hành một số điều của Luật Kinh doanh bất động sản;</w:t>
-      </w:r>
-    </w:p>
-    <w:p>
-      <w:r>
-        <w:t>Căn cứ Nghị định số .../ .../ NĐ-CP ngày ... tháng ... năm ... của Chính phủ quy định chi tiết thi hành một số điều của Luật Nhà ở;</w:t>
-      </w:r>
-    </w:p>
-    <w:p>
-      <w:r>
-        <w:t>Căn cứ khác .................................................................................</w:t>
-      </w:r>
-      <w:r>
-        <w:t>............................</w:t>
-      </w:r>
-      <w:r>
-        <w:t> </w:t>
-      </w:r>
-    </w:p>
-    <w:p>
-      <w:r>
-        <w:t>Căn cứ các văn bản, hồ sơ pháp lý dự án, căn hộ chung cư: .....</w:t>
-      </w:r>
-      <w:r>
-        <w:t>..............................</w:t>
-      </w:r>
-      <w:r>
-        <w:t> </w:t>
-      </w:r>
-    </w:p>
-    <w:p>
-      <w:r>
-        <w:t xml:space="preserve">Các </w:t>
-      </w:r>
-      <w:r>
-        <w:t>b</w:t>
-      </w:r>
-      <w:r>
-        <w:t>ên dưới đây gồm: </w:t>
-      </w:r>
-    </w:p>
-    <w:p>
-      <w:r>
-        <w:rPr>
-          <w:b/>
-          <w:bCs/>
-        </w:rPr>
-        <w:t>I.</w:t>
-      </w:r>
-      <w:r>
-        <w:rPr>
-          <w:b/>
-          <w:bCs/>
-        </w:rPr>
-        <w:t xml:space="preserve"> BÊN BÁN CĂN HỘ</w:t>
-      </w:r>
-      <w:r>
-        <w:rPr>
-          <w:b/>
-          <w:bCs/>
-        </w:rPr>
-        <w:t xml:space="preserve"> (</w:t>
-      </w:r>
-      <w:r>
-        <w:rPr>
-          <w:b/>
-          <w:bCs/>
-        </w:rPr>
-        <w:t>BÊN A</w:t>
-      </w:r>
-      <w:r>
-        <w:rPr>
-          <w:b/>
-          <w:bCs/>
-        </w:rPr>
-        <w:t>):</w:t>
-      </w:r>
-    </w:p>
-    <w:p>
-      <w:r>
-        <w:t>- Tên tổ chức</w:t>
-      </w:r>
-      <w:r>
-        <w:t>: Quản lí căn hộ chung cư</w:t>
-      </w:r>
-      <w:r>
-        <w:t> </w:t>
-      </w:r>
-    </w:p>
-    <w:p>
-      <w:r>
-        <w:t xml:space="preserve">- Người đại diện theo pháp luật: </w:t>
-      </w:r>
-      <w:r>
-        <w:t>Huỳnh Nhật Minh</w:t>
-      </w:r>
-      <w:r>
-        <w:t xml:space="preserve">  </w:t>
-      </w:r>
-    </w:p>
-    <w:p>
-      <w:r>
-        <w:t xml:space="preserve">- </w:t>
-      </w:r>
-      <w:r>
-        <w:t xml:space="preserve">Chức vụ: </w:t>
-      </w:r>
-      <w:r>
-        <w:t>Trưởng ban quản lí</w:t>
-      </w:r>
-    </w:p>
-    <w:p>
-      <w:r>
-        <w:t xml:space="preserve">- Địa chỉ: </w:t>
-      </w:r>
-      <w:r>
-        <w:t>Hà Đông, Hà Nội</w:t>
-      </w:r>
-      <w:r>
-        <w:t> </w:t>
-      </w:r>
-    </w:p>
-    <w:p>
-      <w:r>
-        <w:lastRenderedPageBreak/>
-        <w:t xml:space="preserve">- Điện thoại liên hệ: </w:t>
-      </w:r>
-      <w:r>
-        <w:t>0987654321</w:t>
-      </w:r>
-    </w:p>
-    <w:p>
-      <w:r>
-        <w:t>- Mã số thuế: ..........................................................................................</w:t>
-      </w:r>
-      <w:r>
-        <w:t>.…………</w:t>
-      </w:r>
-    </w:p>
-    <w:p>
-      <w:r>
-        <w:rPr>
-          <w:b/>
-          <w:bCs/>
-        </w:rPr>
-        <w:t xml:space="preserve">II. </w:t>
-      </w:r>
-      <w:r>
-        <w:rPr>
-          <w:b/>
-          <w:bCs/>
-        </w:rPr>
-        <w:t>BÊN MUA CĂN HỘ CHUNG CƯ (BÊN B):</w:t>
-      </w:r>
-    </w:p>
-    <w:p>
-      <w:r>
-        <w:t>- Tên cá nhân</w:t>
-      </w:r>
-      <w:r>
-        <w:t xml:space="preserve"> đại diện</w:t>
-      </w:r>
-      <w:r>
-        <w:t>: </w:t>
+          <w:color w:val="000000" w:themeColor="text1"/>
+        </w:rPr>
+        <w:t>II. BÊN MUA CĂN HỘ CHUNG CƯ (BÊN B):</w:t>
+      </w:r>
+    </w:p>
+    <w:p>
+      <w:pPr>
+        <w:rPr>
+          <w:color w:val="000000" w:themeColor="text1"/>
+        </w:rPr>
+      </w:pPr>
+      <w:r>
+        <w:rPr>
+          <w:color w:val="000000" w:themeColor="text1"/>
+        </w:rPr>
+        <w:t>- Tên cá nhân đại diện: </w:t>
       </w:r>
       <w:sdt>
         <w:sdtPr>
+          <w:rPr>
+            <w:color w:val="000000" w:themeColor="text1"/>
+          </w:rPr>
           <w:alias w:val="representative"/>
           <w:tag w:val="text"/>
           <w:id w:val="1379439979"/>
           <w:placeholder>
-            <w:docPart w:val="451C46F0BB8043BFBBE82278A3D4C16E"/>
+            <w:docPart w:val="853CF763377A45ACA4B289B8E4CE1FEC"/>
           </w:placeholder>
           <w:showingPlcHdr/>
           <w:text/>
@@ -322,6 +376,7 @@
           <w:r>
             <w:rPr>
               <w:rStyle w:val="PlaceholderText"/>
+              <w:color w:val="000000" w:themeColor="text1"/>
             </w:rPr>
             <w:t>Click or tap here to enter text.</w:t>
           </w:r>
@@ -329,37 +384,48 @@
       </w:sdt>
     </w:p>
     <w:p>
-      <w:r>
-        <w:t>Danh sách cư dân</w:t>
-      </w:r>
-    </w:p>
-    <w:p>
-      <w:pPr>
-        <w:tabs>
-          <w:tab w:val="left" w:pos="8672"/>
-        </w:tabs>
-      </w:pPr>
-      <w:sdt>
-        <w:sdtPr>
-          <w:alias w:val="residents"/>
-          <w:tag w:val="list"/>
-          <w:id w:val="193196159"/>
-          <w:placeholder>
-            <w:docPart w:val="DefaultPlaceholder_-1854013440"/>
-          </w:placeholder>
-          <w:showingPlcHdr/>
-        </w:sdtPr>
-        <w:sdtContent>
-          <w:r>
-            <w:br/>
-          </w:r>
+      <w:pPr>
+        <w:rPr>
+          <w:color w:val="000000" w:themeColor="text1"/>
+        </w:rPr>
+      </w:pPr>
+      <w:r>
+        <w:rPr>
+          <w:color w:val="000000" w:themeColor="text1"/>
+        </w:rPr>
+        <w:t>- Danh sách các cá nhân (nếu có):</w:t>
+      </w:r>
+    </w:p>
+    <w:sdt>
+      <w:sdtPr>
+        <w:rPr>
+          <w:color w:val="000000" w:themeColor="text1"/>
+        </w:rPr>
+        <w:alias w:val="residents"/>
+        <w:tag w:val="list"/>
+        <w:id w:val="-990644963"/>
+        <w:placeholder>
+          <w:docPart w:val="DefaultPlaceholder_-1854013440"/>
+        </w:placeholder>
+        <w:showingPlcHdr/>
+      </w:sdtPr>
+      <w:sdtContent>
+        <w:p>
+          <w:pPr>
+            <w:rPr>
+              <w:color w:val="000000" w:themeColor="text1"/>
+            </w:rPr>
+          </w:pPr>
           <w:sdt>
             <w:sdtPr>
+              <w:rPr>
+                <w:color w:val="000000" w:themeColor="text1"/>
+              </w:rPr>
               <w:alias w:val="resident_name"/>
               <w:tag w:val="text"/>
-              <w:id w:val="-812258456"/>
+              <w:id w:val="-196539536"/>
               <w:placeholder>
-                <w:docPart w:val="DE76DF7444E84A889BAB0FC407FEB17D"/>
+                <w:docPart w:val="A9BF5630463F462EA219286500D9DAF7"/>
               </w:placeholder>
               <w:showingPlcHdr/>
               <w:text/>
@@ -368,24 +434,28 @@
               <w:r>
                 <w:rPr>
                   <w:rStyle w:val="PlaceholderText"/>
+                  <w:color w:val="000000" w:themeColor="text1"/>
                 </w:rPr>
                 <w:t>Click or tap here to enter text.</w:t>
               </w:r>
             </w:sdtContent>
           </w:sdt>
           <w:r>
-            <w:t xml:space="preserve"> </w:t>
-          </w:r>
-          <w:r>
-            <w:br/>
+            <w:rPr>
+              <w:color w:val="000000" w:themeColor="text1"/>
+            </w:rPr>
+            <w:t xml:space="preserve">- </w:t>
           </w:r>
           <w:sdt>
             <w:sdtPr>
+              <w:rPr>
+                <w:color w:val="000000" w:themeColor="text1"/>
+              </w:rPr>
               <w:alias w:val="resident_cccd"/>
               <w:tag w:val="text"/>
-              <w:id w:val="-468748688"/>
+              <w:id w:val="-749117412"/>
               <w:placeholder>
-                <w:docPart w:val="70F6A5F631E447078C89BDF3F5458EB5"/>
+                <w:docPart w:val="A2B922179FB34629AFC41165ECAD196E"/>
               </w:placeholder>
               <w:showingPlcHdr/>
               <w:text/>
@@ -394,21 +464,28 @@
               <w:r>
                 <w:rPr>
                   <w:rStyle w:val="PlaceholderText"/>
+                  <w:color w:val="000000" w:themeColor="text1"/>
                 </w:rPr>
                 <w:t>Click or tap here to enter text.</w:t>
               </w:r>
             </w:sdtContent>
           </w:sdt>
           <w:r>
-            <w:br/>
+            <w:rPr>
+              <w:color w:val="000000" w:themeColor="text1"/>
+            </w:rPr>
+            <w:t>-</w:t>
           </w:r>
           <w:sdt>
             <w:sdtPr>
+              <w:rPr>
+                <w:color w:val="000000" w:themeColor="text1"/>
+              </w:rPr>
               <w:alias w:val="resident_phone"/>
               <w:tag w:val="text"/>
-              <w:id w:val="-2078198858"/>
+              <w:id w:val="-2053528099"/>
               <w:placeholder>
-                <w:docPart w:val="F1BE0A69C7ED4A6C98CD4C369DD84B24"/>
+                <w:docPart w:val="994D7BA1863F4C78B7EE7927865E1143"/>
               </w:placeholder>
               <w:showingPlcHdr/>
               <w:text/>
@@ -417,101 +494,106 @@
               <w:r>
                 <w:rPr>
                   <w:rStyle w:val="PlaceholderText"/>
+                  <w:color w:val="000000" w:themeColor="text1"/>
                 </w:rPr>
                 <w:t>Click or tap here to enter text.</w:t>
               </w:r>
             </w:sdtContent>
           </w:sdt>
-          <w:r>
-            <w:br/>
-          </w:r>
-        </w:sdtContent>
-      </w:sdt>
-      <w:r>
-        <w:tab/>
-      </w:r>
-      <w:r>
-        <w:tab/>
-      </w:r>
-    </w:p>
-    <w:p>
-      <w:r>
-        <w:t>Hai bên đồng ý ký kết bản hợp đồng</w:t>
-      </w:r>
-      <w:r>
-        <w:t xml:space="preserve"> thuê</w:t>
-      </w:r>
-      <w:r>
-        <w:t xml:space="preserve"> căn hộ chung cư này với các điều, khoản sau đây:</w:t>
+        </w:p>
+      </w:sdtContent>
+    </w:sdt>
+    <w:p>
+      <w:pPr>
+        <w:rPr>
+          <w:color w:val="000000" w:themeColor="text1"/>
+        </w:rPr>
+      </w:pPr>
+      <w:r>
+        <w:rPr>
+          <w:color w:val="000000" w:themeColor="text1"/>
+        </w:rPr>
+        <w:t>Hai bên đồng ý ký kết bản hợp đồng thuê căn hộ chung cư này với các điều, khoản sau đây:</w:t>
       </w:r>
       <w:bookmarkEnd w:id="0"/>
     </w:p>
     <w:p>
+      <w:pPr>
+        <w:rPr>
+          <w:color w:val="000000" w:themeColor="text1"/>
+        </w:rPr>
+      </w:pPr>
       <w:bookmarkStart w:id="1" w:name="_Hlk197211279"/>
       <w:r>
         <w:rPr>
           <w:b/>
           <w:bCs/>
+          <w:color w:val="000000" w:themeColor="text1"/>
         </w:rPr>
         <w:t>Điều 1: ĐỐI TƯỢNG VÀ NỘI DUNG HỢP ĐỒNG</w:t>
       </w:r>
     </w:p>
     <w:p>
-      <w:r>
-        <w:t>1.1. Bên A cho bên B thuê</w:t>
-      </w:r>
-      <w:r>
-        <w:t xml:space="preserve"> t</w:t>
-      </w:r>
-      <w:r>
-        <w:t>ại: ..........................................................................</w:t>
-      </w:r>
-      <w:r>
-        <w:t>.......</w:t>
-      </w:r>
-      <w:r>
-        <w:t> </w:t>
-      </w:r>
-    </w:p>
-    <w:p>
-      <w:r>
-        <w:t>đ</w:t>
-      </w:r>
-      <w:r>
-        <w:t>ể sử dụng vào mục đích: ...........................................................................</w:t>
-      </w:r>
-      <w:r>
-        <w:t>............</w:t>
-      </w:r>
-      <w:r>
-        <w:t> </w:t>
-      </w:r>
-    </w:p>
-    <w:p>
-      <w:r>
+      <w:pPr>
+        <w:rPr>
+          <w:color w:val="000000" w:themeColor="text1"/>
+        </w:rPr>
+      </w:pPr>
+      <w:r>
+        <w:rPr>
+          <w:color w:val="000000" w:themeColor="text1"/>
+        </w:rPr>
+        <w:t>1.1. Bên A cho bên B thuê tại: ................................................................................. </w:t>
+      </w:r>
+    </w:p>
+    <w:p>
+      <w:pPr>
+        <w:rPr>
+          <w:color w:val="000000" w:themeColor="text1"/>
+        </w:rPr>
+      </w:pPr>
+      <w:r>
+        <w:rPr>
+          <w:color w:val="000000" w:themeColor="text1"/>
+        </w:rPr>
+        <w:t>để sử dụng vào mục đích: ....................................................................................... </w:t>
+      </w:r>
+    </w:p>
+    <w:p>
+      <w:pPr>
+        <w:rPr>
+          <w:color w:val="000000" w:themeColor="text1"/>
+        </w:rPr>
+      </w:pPr>
+      <w:r>
+        <w:rPr>
+          <w:color w:val="000000" w:themeColor="text1"/>
+        </w:rPr>
         <w:t>1.2. Quyền sở hữu của bên A đối với căn hộ cụ thể như sau:</w:t>
       </w:r>
     </w:p>
     <w:p>
-      <w:r>
-        <w:t>a) Địa chỉ</w:t>
-      </w:r>
-      <w:r>
-        <w:t xml:space="preserve"> tòa nhà </w:t>
-      </w:r>
-      <w:r>
-        <w:t>căn hộ</w:t>
-      </w:r>
-      <w:r>
-        <w:t xml:space="preserve">: </w:t>
+      <w:pPr>
+        <w:rPr>
+          <w:color w:val="000000" w:themeColor="text1"/>
+        </w:rPr>
+      </w:pPr>
+      <w:r>
+        <w:rPr>
+          <w:color w:val="000000" w:themeColor="text1"/>
+        </w:rPr>
+        <w:t xml:space="preserve">a) Địa chỉ tòa nhà căn hộ: </w:t>
       </w:r>
       <w:sdt>
         <w:sdtPr>
+          <w:rPr>
+            <w:color w:val="000000" w:themeColor="text1"/>
+          </w:rPr>
           <w:alias w:val="building"/>
           <w:tag w:val="text"/>
-          <w:id w:val="10043041"/>
+          <w:id w:val="-1514294962"/>
           <w:placeholder>
-            <w:docPart w:val="5513D8C4184E4EF086A4063A9D9C3764"/>
+            <w:docPart w:val="86A13E55BF6A4AC2828AE3B1758ACEFB"/>
           </w:placeholder>
           <w:showingPlcHdr/>
           <w:text/>
@@ -520,29 +602,35 @@
           <w:r>
             <w:rPr>
               <w:rStyle w:val="PlaceholderText"/>
+              <w:color w:val="000000" w:themeColor="text1"/>
             </w:rPr>
             <w:t>Click or tap here to enter text.</w:t>
           </w:r>
         </w:sdtContent>
       </w:sdt>
-      <w:r>
-        <w:t xml:space="preserve"> </w:t>
-      </w:r>
-    </w:p>
-    <w:p>
-      <w:r>
-        <w:t>b) Căn hộ số:</w:t>
-      </w:r>
-      <w:r>
-        <w:t xml:space="preserve"> </w:t>
+    </w:p>
+    <w:p>
+      <w:pPr>
+        <w:rPr>
+          <w:color w:val="000000" w:themeColor="text1"/>
+        </w:rPr>
+      </w:pPr>
+      <w:r>
+        <w:rPr>
+          <w:color w:val="000000" w:themeColor="text1"/>
+        </w:rPr>
+        <w:t xml:space="preserve">b) Căn hộ số: </w:t>
       </w:r>
       <w:sdt>
         <w:sdtPr>
+          <w:rPr>
+            <w:color w:val="000000" w:themeColor="text1"/>
+          </w:rPr>
           <w:alias w:val="apartment_name"/>
           <w:tag w:val="text"/>
-          <w:id w:val="232213078"/>
+          <w:id w:val="-521708267"/>
           <w:placeholder>
-            <w:docPart w:val="A0FE7D89F06E4EF494ECD88DA7769205"/>
+            <w:docPart w:val="E7101914D11D4BDC9DB6DE368C98B969"/>
           </w:placeholder>
           <w:showingPlcHdr/>
           <w:text/>
@@ -551,6 +639,7 @@
           <w:r>
             <w:rPr>
               <w:rStyle w:val="PlaceholderText"/>
+              <w:color w:val="000000" w:themeColor="text1"/>
             </w:rPr>
             <w:t>Click or tap here to enter text.</w:t>
           </w:r>
@@ -558,19 +647,27 @@
       </w:sdt>
     </w:p>
     <w:p>
-      <w:r>
-        <w:t>d) Tổng diện tích sàn căn hộ là:</w:t>
-      </w:r>
-      <w:r>
-        <w:t xml:space="preserve"> </w:t>
+      <w:pPr>
+        <w:rPr>
+          <w:color w:val="000000" w:themeColor="text1"/>
+        </w:rPr>
+      </w:pPr>
+      <w:r>
+        <w:rPr>
+          <w:color w:val="000000" w:themeColor="text1"/>
+        </w:rPr>
+        <w:t xml:space="preserve">d) Tổng diện tích sàn căn hộ là:  </w:t>
       </w:r>
       <w:sdt>
         <w:sdtPr>
+          <w:rPr>
+            <w:color w:val="000000" w:themeColor="text1"/>
+          </w:rPr>
           <w:alias w:val="area"/>
           <w:tag w:val="text"/>
-          <w:id w:val="-1048144121"/>
+          <w:id w:val="547116923"/>
           <w:placeholder>
-            <w:docPart w:val="BC7BB2D302D045F180CC2A1E9F4D5CF9"/>
+            <w:docPart w:val="5B6DF39B40544798AB737C73C0351438"/>
           </w:placeholder>
           <w:showingPlcHdr/>
           <w:text/>
@@ -579,39 +676,61 @@
           <w:r>
             <w:rPr>
               <w:rStyle w:val="PlaceholderText"/>
+              <w:color w:val="000000" w:themeColor="text1"/>
             </w:rPr>
             <w:t>Click or tap here to enter text.</w:t>
           </w:r>
         </w:sdtContent>
       </w:sdt>
       <w:r>
+        <w:rPr>
+          <w:color w:val="000000" w:themeColor="text1"/>
+        </w:rPr>
         <w:t xml:space="preserve"> </w:t>
       </w:r>
       <w:r>
+        <w:rPr>
+          <w:color w:val="000000" w:themeColor="text1"/>
+        </w:rPr>
         <w:t>m2</w:t>
       </w:r>
     </w:p>
     <w:p>
-      <w:r>
-        <w:t>e) Trang thiết bị gắn liền với căn hộ: .......................................................</w:t>
-      </w:r>
-      <w:r>
-        <w:t>...............</w:t>
-      </w:r>
-      <w:r>
-        <w:t>. </w:t>
-      </w:r>
-    </w:p>
-    <w:p>
-      <w:r>
-        <w:t xml:space="preserve">f) Nguồn gốc sở hữu: </w:t>
-      </w:r>
-      <w:r>
-        <w:t>Thuộc quản lí chung cư</w:t>
-      </w:r>
-    </w:p>
-    <w:p>
-      <w:r>
+      <w:pPr>
+        <w:rPr>
+          <w:color w:val="000000" w:themeColor="text1"/>
+        </w:rPr>
+      </w:pPr>
+      <w:r>
+        <w:rPr>
+          <w:color w:val="000000" w:themeColor="text1"/>
+        </w:rPr>
+        <w:t>e) Trang thiết bị gắn liền với căn hộ: ....................................................................... </w:t>
+      </w:r>
+    </w:p>
+    <w:p>
+      <w:pPr>
+        <w:rPr>
+          <w:color w:val="000000" w:themeColor="text1"/>
+        </w:rPr>
+      </w:pPr>
+      <w:r>
+        <w:rPr>
+          <w:color w:val="000000" w:themeColor="text1"/>
+        </w:rPr>
+        <w:t>f) Nguồn gốc sở hữu: Thuộc quản lí chung cư</w:t>
+      </w:r>
+    </w:p>
+    <w:p>
+      <w:pPr>
+        <w:rPr>
+          <w:color w:val="000000" w:themeColor="text1"/>
+        </w:rPr>
+      </w:pPr>
+      <w:r>
+        <w:rPr>
+          <w:color w:val="000000" w:themeColor="text1"/>
+        </w:rPr>
         <w:t>g)</w:t>
       </w:r>
       <w:r>
@@ -620,85 +739,79 @@
           <w:bCs/>
           <w:i/>
           <w:iCs/>
-        </w:rPr>
-        <w:t> Những hạn chế về quyền sở hữu căn hộ (nếu</w:t>
-      </w:r>
-      <w:r>
-        <w:rPr>
+          <w:color w:val="000000" w:themeColor="text1"/>
+        </w:rPr>
+        <w:t> Những hạn chế về quyền sở hữu căn hộ (nếu có):</w:t>
+      </w:r>
+      <w:r>
+        <w:rPr>
+          <w:color w:val="000000" w:themeColor="text1"/>
+        </w:rPr>
+        <w:t> ....................................... </w:t>
+      </w:r>
+    </w:p>
+    <w:bookmarkEnd w:id="1"/>
+    <w:p>
+      <w:pPr>
+        <w:rPr>
+          <w:color w:val="000000" w:themeColor="text1"/>
+        </w:rPr>
+      </w:pPr>
+      <w:r>
+        <w:rPr>
+          <w:color w:val="000000" w:themeColor="text1"/>
+        </w:rPr>
+        <w:t> </w:t>
+      </w:r>
+    </w:p>
+    <w:p>
+      <w:pPr>
+        <w:rPr>
+          <w:rFonts w:cs="Times New Roman"/>
           <w:b/>
           <w:bCs/>
-          <w:i/>
-          <w:iCs/>
-        </w:rPr>
-        <w:t xml:space="preserve"> </w:t>
-      </w:r>
-      <w:r>
-        <w:rPr>
+          <w:color w:val="000000" w:themeColor="text1"/>
+          <w:szCs w:val="28"/>
+        </w:rPr>
+      </w:pPr>
+      <w:r>
+        <w:rPr>
+          <w:rFonts w:cs="Times New Roman"/>
           <w:b/>
           <w:bCs/>
-          <w:i/>
-          <w:iCs/>
-        </w:rPr>
-        <w:t>có):</w:t>
-      </w:r>
-      <w:r>
-        <w:t> .</w:t>
-      </w:r>
-      <w:r>
-        <w:t>......................................</w:t>
-      </w:r>
-      <w:r>
-        <w:t> </w:t>
-      </w:r>
-    </w:p>
-    <w:bookmarkEnd w:id="1"/>
-    <w:p>
-      <w:r>
-        <w:t> </w:t>
-      </w:r>
-    </w:p>
-    <w:p>
-      <w:pPr>
-        <w:rPr>
-          <w:rFonts w:cs="Times New Roman"/>
-          <w:b/>
-          <w:bCs/>
-          <w:szCs w:val="28"/>
-        </w:rPr>
-      </w:pPr>
-      <w:r>
-        <w:rPr>
-          <w:rFonts w:cs="Times New Roman"/>
-          <w:b/>
-          <w:bCs/>
+          <w:color w:val="000000" w:themeColor="text1"/>
+          <w:szCs w:val="28"/>
+        </w:rPr>
+        <w:t>ĐIỀU 2: GIÁ BÁN CĂN HỘ, PHƯƠNG THỨC VÀ THỜI HẠN THANH TOÁN</w:t>
+      </w:r>
+    </w:p>
+    <w:p>
+      <w:pPr>
+        <w:rPr>
+          <w:color w:val="000000" w:themeColor="text1"/>
+        </w:rPr>
+      </w:pPr>
+      <w:r>
+        <w:rPr>
+          <w:rFonts w:cs="Times New Roman"/>
+          <w:color w:val="000000" w:themeColor="text1"/>
           <w:szCs w:val="28"/>
         </w:rPr>
         <w:lastRenderedPageBreak/>
-        <w:t>ĐIỀU 2: GIÁ BÁN CĂN HỘ, PHƯƠNG THỨC VÀ THỜI HẠN THANH TOÁN</w:t>
-      </w:r>
-    </w:p>
-    <w:p>
-      <w:r>
-        <w:rPr>
-          <w:rFonts w:cs="Times New Roman"/>
-          <w:szCs w:val="28"/>
-        </w:rPr>
-        <w:t xml:space="preserve">2.1. </w:t>
-      </w:r>
-      <w:r>
-        <w:rPr>
-          <w:rFonts w:cs="Times New Roman"/>
-          <w:szCs w:val="28"/>
-        </w:rPr>
-        <w:t xml:space="preserve">Giá bán căn hộ là </w:t>
+        <w:t xml:space="preserve">2.1. Giá bán căn hộ là  </w:t>
       </w:r>
       <w:sdt>
         <w:sdtPr>
+          <w:rPr>
+            <w:rFonts w:cs="Times New Roman"/>
+            <w:color w:val="000000" w:themeColor="text1"/>
+            <w:szCs w:val="28"/>
+          </w:rPr>
           <w:alias w:val="price"/>
           <w:tag w:val="text"/>
-          <w:id w:val="-1815872080"/>
+          <w:id w:val="2092880173"/>
           <w:placeholder>
-            <w:docPart w:val="24CAD0A8F14F4B3E9AD64C05D0E31F76"/>
+            <w:docPart w:val="4A3EB98DE1EB4BA6A2F51900886A6B33"/>
           </w:placeholder>
           <w:showingPlcHdr/>
           <w:text/>
@@ -707,6 +820,7 @@
           <w:r>
             <w:rPr>
               <w:rStyle w:val="PlaceholderText"/>
+              <w:color w:val="000000" w:themeColor="text1"/>
             </w:rPr>
             <w:t>Click or tap here to enter text.</w:t>
           </w:r>
@@ -715,6 +829,7 @@
       <w:r>
         <w:rPr>
           <w:rFonts w:cs="Times New Roman"/>
+          <w:color w:val="000000" w:themeColor="text1"/>
           <w:szCs w:val="28"/>
         </w:rPr>
         <w:t xml:space="preserve"> </w:t>
@@ -722,29 +837,17 @@
       <w:r>
         <w:rPr>
           <w:rFonts w:cs="Times New Roman"/>
-          <w:szCs w:val="28"/>
-        </w:rPr>
-        <w:t>VN</w:t>
-      </w:r>
-      <w:r>
-        <w:rPr>
-          <w:rFonts w:cs="Times New Roman"/>
-          <w:szCs w:val="28"/>
-        </w:rPr>
-        <w:t>Đ</w:t>
-      </w:r>
-      <w:r>
-        <w:rPr>
-          <w:rFonts w:cs="Times New Roman"/>
-          <w:szCs w:val="28"/>
-        </w:rPr>
-        <w:t> </w:t>
-      </w:r>
-    </w:p>
-    <w:p>
-      <w:pPr>
-        <w:rPr>
-          <w:rFonts w:cs="Times New Roman"/>
+          <w:color w:val="000000" w:themeColor="text1"/>
+          <w:szCs w:val="28"/>
+        </w:rPr>
+        <w:t>VNĐ </w:t>
+      </w:r>
+    </w:p>
+    <w:p>
+      <w:pPr>
+        <w:rPr>
+          <w:rFonts w:cs="Times New Roman"/>
+          <w:color w:val="000000" w:themeColor="text1"/>
           <w:szCs w:val="28"/>
         </w:rPr>
       </w:pPr>
@@ -753,200 +856,151 @@
           <w:rFonts w:cs="Times New Roman"/>
           <w:i/>
           <w:iCs/>
-          <w:szCs w:val="28"/>
-        </w:rPr>
-        <w:t>(bằng</w:t>
-      </w:r>
-      <w:r>
+          <w:color w:val="000000" w:themeColor="text1"/>
+          <w:szCs w:val="28"/>
+        </w:rPr>
+        <w:t>(bằng chữ:………………………………………………………………………………….)</w:t>
+      </w:r>
+    </w:p>
+    <w:p>
+      <w:pPr>
         <w:rPr>
           <w:rFonts w:cs="Times New Roman"/>
           <w:i/>
           <w:iCs/>
-          <w:szCs w:val="28"/>
-        </w:rPr>
-        <w:t xml:space="preserve"> </w:t>
+          <w:color w:val="000000" w:themeColor="text1"/>
+          <w:szCs w:val="28"/>
+        </w:rPr>
+      </w:pPr>
+      <w:r>
+        <w:rPr>
+          <w:rFonts w:cs="Times New Roman"/>
+          <w:color w:val="000000" w:themeColor="text1"/>
+          <w:szCs w:val="28"/>
+        </w:rPr>
+        <w:t>(</w:t>
       </w:r>
       <w:r>
         <w:rPr>
           <w:rFonts w:cs="Times New Roman"/>
           <w:i/>
           <w:iCs/>
-          <w:szCs w:val="28"/>
-        </w:rPr>
-        <w:t>chữ:</w:t>
-      </w:r>
+          <w:color w:val="000000" w:themeColor="text1"/>
+          <w:szCs w:val="28"/>
+        </w:rPr>
+        <w:t>Trường hợp bên bán chưa thanh toán đủ cho chủ đầu tư, thì phải quy định rõ giá bán đã bao gồm, chưa bao gồm gì)……………………………………………………….</w:t>
+      </w:r>
+    </w:p>
+    <w:p>
+      <w:pPr>
+        <w:rPr>
+          <w:rFonts w:cs="Times New Roman"/>
+          <w:color w:val="000000" w:themeColor="text1"/>
+          <w:szCs w:val="28"/>
+        </w:rPr>
+      </w:pPr>
       <w:r>
         <w:rPr>
           <w:rFonts w:cs="Times New Roman"/>
           <w:i/>
           <w:iCs/>
-          <w:szCs w:val="28"/>
-        </w:rPr>
-        <w:t>………………………………………………………………………………….</w:t>
+          <w:color w:val="000000" w:themeColor="text1"/>
+          <w:szCs w:val="28"/>
+        </w:rPr>
+        <w:t>……………………………………………………………………………………………………………………………………………………………………………………………………..</w:t>
+      </w:r>
+    </w:p>
+    <w:p>
+      <w:pPr>
+        <w:rPr>
+          <w:rFonts w:cs="Times New Roman"/>
+          <w:color w:val="000000" w:themeColor="text1"/>
+          <w:szCs w:val="28"/>
+        </w:rPr>
+      </w:pPr>
+      <w:r>
+        <w:rPr>
+          <w:rFonts w:cs="Times New Roman"/>
+          <w:color w:val="000000" w:themeColor="text1"/>
+          <w:szCs w:val="28"/>
+        </w:rPr>
+        <w:t>2.2. Phương thức thanh toán: thanh toán bằng tiền Việt Nam thông qua hình thức (</w:t>
       </w:r>
       <w:r>
         <w:rPr>
           <w:rFonts w:cs="Times New Roman"/>
           <w:i/>
           <w:iCs/>
-          <w:szCs w:val="28"/>
-        </w:rPr>
-        <w:t>)</w:t>
-      </w:r>
-    </w:p>
-    <w:p>
-      <w:pPr>
+          <w:color w:val="000000" w:themeColor="text1"/>
+          <w:szCs w:val="28"/>
+        </w:rPr>
+        <w:t>trả bằng tiền mặt hoặc chuyển khoản qua ngân hàng</w:t>
+      </w:r>
+      <w:r>
+        <w:rPr>
+          <w:rFonts w:cs="Times New Roman"/>
+          <w:color w:val="000000" w:themeColor="text1"/>
+          <w:szCs w:val="28"/>
+        </w:rPr>
+        <w:t xml:space="preserve">) </w:t>
+      </w:r>
+    </w:p>
+    <w:p>
+      <w:pPr>
+        <w:rPr>
+          <w:rFonts w:cs="Times New Roman"/>
+          <w:color w:val="000000" w:themeColor="text1"/>
+          <w:szCs w:val="28"/>
+        </w:rPr>
+      </w:pPr>
+      <w:r>
+        <w:rPr>
+          <w:rFonts w:cs="Times New Roman"/>
+          <w:color w:val="000000" w:themeColor="text1"/>
+          <w:szCs w:val="28"/>
+        </w:rPr>
+        <w:t>2.3. Thời hạn thanh toán: …………………………………………………………...</w:t>
+      </w:r>
+    </w:p>
+    <w:p>
+      <w:pPr>
+        <w:rPr>
+          <w:rFonts w:cs="Times New Roman"/>
+          <w:color w:val="000000" w:themeColor="text1"/>
+          <w:szCs w:val="28"/>
+        </w:rPr>
+      </w:pPr>
+      <w:r>
+        <w:rPr>
+          <w:rFonts w:cs="Times New Roman"/>
+          <w:color w:val="000000" w:themeColor="text1"/>
+          <w:szCs w:val="28"/>
+        </w:rPr>
+        <w:t>……………………………………………………………………………………….……………………………………………………………………………………….</w:t>
+      </w:r>
+    </w:p>
+    <w:p>
+      <w:pPr>
+        <w:rPr>
+          <w:rFonts w:cs="Times New Roman"/>
+          <w:color w:val="000000" w:themeColor="text1"/>
+          <w:szCs w:val="28"/>
+        </w:rPr>
+      </w:pPr>
+      <w:r>
+        <w:rPr>
+          <w:rFonts w:cs="Times New Roman"/>
+          <w:color w:val="000000" w:themeColor="text1"/>
+          <w:szCs w:val="28"/>
+        </w:rPr>
+        <w:t xml:space="preserve"> (</w:t>
+      </w:r>
+      <w:r>
         <w:rPr>
           <w:rFonts w:cs="Times New Roman"/>
           <w:i/>
           <w:iCs/>
-          <w:szCs w:val="28"/>
-        </w:rPr>
-      </w:pPr>
-      <w:r>
-        <w:rPr>
-          <w:rFonts w:cs="Times New Roman"/>
-          <w:szCs w:val="28"/>
-        </w:rPr>
-        <w:t>(</w:t>
-      </w:r>
-      <w:r>
-        <w:rPr>
-          <w:rFonts w:cs="Times New Roman"/>
-          <w:i/>
-          <w:iCs/>
-          <w:szCs w:val="28"/>
-        </w:rPr>
-        <w:t>Trường hợp bên bán chưa thanh toán đủ cho chủ đầu tư, thì phải quy định rõ giá bán đã bao gồm, chưa bao gồm gì)</w:t>
-      </w:r>
-      <w:r>
-        <w:rPr>
-          <w:rFonts w:cs="Times New Roman"/>
-          <w:i/>
-          <w:iCs/>
-          <w:szCs w:val="28"/>
-        </w:rPr>
-        <w:t>……………………………………………………….</w:t>
-      </w:r>
-    </w:p>
-    <w:p>
-      <w:pPr>
-        <w:rPr>
-          <w:rFonts w:cs="Times New Roman"/>
-          <w:szCs w:val="28"/>
-        </w:rPr>
-      </w:pPr>
-      <w:r>
-        <w:rPr>
-          <w:rFonts w:cs="Times New Roman"/>
-          <w:i/>
-          <w:iCs/>
-          <w:szCs w:val="28"/>
-        </w:rPr>
-        <w:t>……………………………………………………………………………………………………………………………………………………………………………………………………..</w:t>
-      </w:r>
-    </w:p>
-    <w:p>
-      <w:pPr>
-        <w:rPr>
-          <w:rFonts w:cs="Times New Roman"/>
-          <w:szCs w:val="28"/>
-        </w:rPr>
-      </w:pPr>
-      <w:r>
-        <w:rPr>
-          <w:rFonts w:cs="Times New Roman"/>
-          <w:szCs w:val="28"/>
-        </w:rPr>
-        <w:t>2.2.</w:t>
-      </w:r>
-      <w:r>
-        <w:rPr>
-          <w:rFonts w:cs="Times New Roman"/>
-          <w:szCs w:val="28"/>
-        </w:rPr>
-        <w:t xml:space="preserve"> Phương thức thanh toán: thanh toán bằng tiền Việt Nam thông qua hình thức (</w:t>
-      </w:r>
-      <w:r>
-        <w:rPr>
-          <w:rFonts w:cs="Times New Roman"/>
-          <w:i/>
-          <w:iCs/>
-          <w:szCs w:val="28"/>
-        </w:rPr>
-        <w:t>trả bằng tiền mặt hoặc chuyển khoản qua ngân hàng</w:t>
-      </w:r>
-      <w:r>
-        <w:rPr>
-          <w:rFonts w:cs="Times New Roman"/>
-          <w:szCs w:val="28"/>
-        </w:rPr>
-        <w:t xml:space="preserve">) </w:t>
-      </w:r>
-    </w:p>
-    <w:p>
-      <w:pPr>
-        <w:rPr>
-          <w:rFonts w:cs="Times New Roman"/>
-          <w:szCs w:val="28"/>
-        </w:rPr>
-      </w:pPr>
-      <w:r>
-        <w:rPr>
-          <w:rFonts w:cs="Times New Roman"/>
-          <w:szCs w:val="28"/>
-        </w:rPr>
-        <w:t xml:space="preserve">2.3. </w:t>
-      </w:r>
-      <w:r>
-        <w:rPr>
-          <w:rFonts w:cs="Times New Roman"/>
-          <w:szCs w:val="28"/>
-        </w:rPr>
-        <w:t>Thời hạn thanh toán:</w:t>
-      </w:r>
-      <w:r>
-        <w:rPr>
-          <w:rFonts w:cs="Times New Roman"/>
-          <w:szCs w:val="28"/>
-        </w:rPr>
-        <w:t xml:space="preserve"> …………………………………………………………...</w:t>
-      </w:r>
-    </w:p>
-    <w:p>
-      <w:pPr>
-        <w:rPr>
-          <w:rFonts w:cs="Times New Roman"/>
-          <w:szCs w:val="28"/>
-        </w:rPr>
-      </w:pPr>
-      <w:r>
-        <w:rPr>
-          <w:rFonts w:cs="Times New Roman"/>
-          <w:szCs w:val="28"/>
-        </w:rPr>
-        <w:t>……………………………………………………………………………………….……………………………………………………………………………………….</w:t>
-      </w:r>
-    </w:p>
-    <w:p>
-      <w:pPr>
-        <w:rPr>
-          <w:rFonts w:cs="Times New Roman"/>
-          <w:szCs w:val="28"/>
-        </w:rPr>
-      </w:pPr>
-      <w:r>
-        <w:rPr>
-          <w:rFonts w:cs="Times New Roman"/>
-          <w:szCs w:val="28"/>
-        </w:rPr>
-        <w:t xml:space="preserve"> (</w:t>
-      </w:r>
-      <w:r>
-        <w:rPr>
-          <w:rFonts w:cs="Times New Roman"/>
-          <w:i/>
-          <w:iCs/>
+          <w:color w:val="000000" w:themeColor="text1"/>
           <w:szCs w:val="28"/>
         </w:rPr>
         <w:t>Quy định rõ việc thanh toán được thực hiện thành mấy đợt, mỗi đợt thanh toán với số tiền là bao nhiêu và ngày của từng đợt thanh toán</w:t>
@@ -954,6 +1008,7 @@
       <w:r>
         <w:rPr>
           <w:rFonts w:cs="Times New Roman"/>
+          <w:color w:val="000000" w:themeColor="text1"/>
           <w:szCs w:val="28"/>
         </w:rPr>
         <w:t>)</w:t>
@@ -965,6 +1020,7 @@
           <w:rFonts w:cs="Times New Roman"/>
           <w:b/>
           <w:bCs/>
+          <w:color w:val="000000" w:themeColor="text1"/>
           <w:szCs w:val="28"/>
         </w:rPr>
       </w:pPr>
@@ -973,6 +1029,7 @@
           <w:rFonts w:cs="Times New Roman"/>
           <w:b/>
           <w:bCs/>
+          <w:color w:val="000000" w:themeColor="text1"/>
           <w:szCs w:val="28"/>
         </w:rPr>
         <w:t>ĐIỀU 3: GIAO NHẬN CĂN HỘ, ĐĂNG KÝ SANG TÊN, THUẾ PHÍ, LỆ PHÍ</w:t>
@@ -982,34 +1039,31 @@
       <w:pPr>
         <w:rPr>
           <w:rFonts w:cs="Times New Roman"/>
-          <w:szCs w:val="28"/>
-        </w:rPr>
-      </w:pPr>
-      <w:r>
-        <w:rPr>
-          <w:rFonts w:cs="Times New Roman"/>
-          <w:szCs w:val="28"/>
-        </w:rPr>
-        <w:t xml:space="preserve">3.1. Bên A có nghĩa vụ giao căn hộ nêu tại Điều 1 của Hợp đồng này cùng toàn bộ bản chính giấy tờ pháp lý của Căn hộ cho Bên B vào ngày </w:t>
-      </w:r>
-      <w:r>
-        <w:rPr>
-          <w:rFonts w:cs="Times New Roman"/>
-          <w:szCs w:val="28"/>
-        </w:rPr>
-        <w:t>……………………….</w:t>
-      </w:r>
-    </w:p>
-    <w:p>
-      <w:pPr>
-        <w:rPr>
-          <w:rFonts w:cs="Times New Roman"/>
-          <w:szCs w:val="28"/>
-        </w:rPr>
-      </w:pPr>
-      <w:r>
-        <w:rPr>
-          <w:rFonts w:cs="Times New Roman"/>
+          <w:color w:val="000000" w:themeColor="text1"/>
+          <w:szCs w:val="28"/>
+        </w:rPr>
+      </w:pPr>
+      <w:r>
+        <w:rPr>
+          <w:rFonts w:cs="Times New Roman"/>
+          <w:color w:val="000000" w:themeColor="text1"/>
+          <w:szCs w:val="28"/>
+        </w:rPr>
+        <w:t>3.1. Bên A có nghĩa vụ giao căn hộ nêu tại Điều 1 của Hợp đồng này cùng toàn bộ bản chính giấy tờ pháp lý của Căn hộ cho Bên B vào ngày ……………………….</w:t>
+      </w:r>
+    </w:p>
+    <w:p>
+      <w:pPr>
+        <w:rPr>
+          <w:rFonts w:cs="Times New Roman"/>
+          <w:color w:val="000000" w:themeColor="text1"/>
+          <w:szCs w:val="28"/>
+        </w:rPr>
+      </w:pPr>
+      <w:r>
+        <w:rPr>
+          <w:rFonts w:cs="Times New Roman"/>
+          <w:color w:val="000000" w:themeColor="text1"/>
           <w:szCs w:val="28"/>
         </w:rPr>
         <w:t>3.2. Bên B có nghĩa vụ đăng ký quyền sở hữu căn hộ tại cơ quan có thẩm quyền theo quy định của pháp luật.</w:t>
@@ -1019,12 +1073,14 @@
       <w:pPr>
         <w:rPr>
           <w:rFonts w:cs="Times New Roman"/>
-          <w:szCs w:val="28"/>
-        </w:rPr>
-      </w:pPr>
-      <w:r>
-        <w:rPr>
-          <w:rFonts w:cs="Times New Roman"/>
+          <w:color w:val="000000" w:themeColor="text1"/>
+          <w:szCs w:val="28"/>
+        </w:rPr>
+      </w:pPr>
+      <w:r>
+        <w:rPr>
+          <w:rFonts w:cs="Times New Roman"/>
+          <w:color w:val="000000" w:themeColor="text1"/>
           <w:szCs w:val="28"/>
         </w:rPr>
         <w:t>3.3. Thuế thu nhập cá nhân, nếu có, liên quan đến việc mua bán căn hộ theo Hợp đồng này do Bên A chịu trách nhiệm nộp.</w:t>
@@ -1034,12 +1090,14 @@
       <w:pPr>
         <w:rPr>
           <w:rFonts w:cs="Times New Roman"/>
-          <w:szCs w:val="28"/>
-        </w:rPr>
-      </w:pPr>
-      <w:r>
-        <w:rPr>
-          <w:rFonts w:cs="Times New Roman"/>
+          <w:color w:val="000000" w:themeColor="text1"/>
+          <w:szCs w:val="28"/>
+        </w:rPr>
+      </w:pPr>
+      <w:r>
+        <w:rPr>
+          <w:rFonts w:cs="Times New Roman"/>
+          <w:color w:val="000000" w:themeColor="text1"/>
           <w:szCs w:val="28"/>
         </w:rPr>
         <w:t>3.4. Lệ phí trước bạ, chi phí làm hồ sơ đăng ký quyền sở hữu Căn hộ do Bên B chịu trách nhiệm nộp.</w:t>
@@ -1051,6 +1109,7 @@
           <w:rFonts w:cs="Times New Roman"/>
           <w:b/>
           <w:bCs/>
+          <w:color w:val="000000" w:themeColor="text1"/>
           <w:szCs w:val="28"/>
         </w:rPr>
       </w:pPr>
@@ -1059,24 +1118,27 @@
           <w:rFonts w:cs="Times New Roman"/>
           <w:b/>
           <w:bCs/>
+          <w:color w:val="000000" w:themeColor="text1"/>
+          <w:szCs w:val="28"/>
+        </w:rPr>
+        <w:t>ĐIỀU 4: CÁC THỎA THUẬN KHÁC</w:t>
+      </w:r>
+    </w:p>
+    <w:p>
+      <w:pPr>
+        <w:rPr>
+          <w:rFonts w:cs="Times New Roman"/>
+          <w:color w:val="000000" w:themeColor="text1"/>
+          <w:szCs w:val="28"/>
+        </w:rPr>
+      </w:pPr>
+      <w:r>
+        <w:rPr>
+          <w:rFonts w:cs="Times New Roman"/>
+          <w:color w:val="000000" w:themeColor="text1"/>
           <w:szCs w:val="28"/>
         </w:rPr>
         <w:lastRenderedPageBreak/>
-        <w:t>ĐIỀU 4: CÁC THỎA THUẬN KHÁC</w:t>
-      </w:r>
-    </w:p>
-    <w:p>
-      <w:pPr>
-        <w:rPr>
-          <w:rFonts w:cs="Times New Roman"/>
-          <w:szCs w:val="28"/>
-        </w:rPr>
-      </w:pPr>
-      <w:r>
-        <w:rPr>
-          <w:rFonts w:cs="Times New Roman"/>
-          <w:szCs w:val="28"/>
-        </w:rPr>
         <w:t>– Bên A cam kết căn hộ nêu tại Điều 1 của Hợp đồng thuộc quyền sở hữu của Bên A và không thuộc diện bị cấm giao dịch theo quy định của pháp luật.</w:t>
       </w:r>
     </w:p>
@@ -1084,12 +1146,14 @@
       <w:pPr>
         <w:rPr>
           <w:rFonts w:cs="Times New Roman"/>
-          <w:szCs w:val="28"/>
-        </w:rPr>
-      </w:pPr>
-      <w:r>
-        <w:rPr>
-          <w:rFonts w:cs="Times New Roman"/>
+          <w:color w:val="000000" w:themeColor="text1"/>
+          <w:szCs w:val="28"/>
+        </w:rPr>
+      </w:pPr>
+      <w:r>
+        <w:rPr>
+          <w:rFonts w:cs="Times New Roman"/>
+          <w:color w:val="000000" w:themeColor="text1"/>
           <w:szCs w:val="28"/>
         </w:rPr>
         <w:t>– Bên B cam kết đã tìm hiểu, xem xét kỹ thông tin về Căn hộ.</w:t>
@@ -1099,12 +1163,14 @@
       <w:pPr>
         <w:rPr>
           <w:rFonts w:cs="Times New Roman"/>
-          <w:szCs w:val="28"/>
-        </w:rPr>
-      </w:pPr>
-      <w:r>
-        <w:rPr>
-          <w:rFonts w:cs="Times New Roman"/>
+          <w:color w:val="000000" w:themeColor="text1"/>
+          <w:szCs w:val="28"/>
+        </w:rPr>
+      </w:pPr>
+      <w:r>
+        <w:rPr>
+          <w:rFonts w:cs="Times New Roman"/>
+          <w:color w:val="000000" w:themeColor="text1"/>
           <w:szCs w:val="28"/>
         </w:rPr>
         <w:t>– Việc ký kết hợp đồng này giữa các bên là hoàn toàn tự nguyện, không bị ép buộc, lừa dối. Trong quá trình thực hiện hợp đồng, nếu cần thay đổi hoặc bổ sung một số nội dung của hợp đồng này thì các bên lập thêm phụ lục hợp đồng có chữ ký của hai bên và có giá trị pháp lý như hợp đồng này.</w:t>
@@ -1114,12 +1180,14 @@
       <w:pPr>
         <w:rPr>
           <w:rFonts w:cs="Times New Roman"/>
-          <w:szCs w:val="28"/>
-        </w:rPr>
-      </w:pPr>
-      <w:r>
-        <w:rPr>
-          <w:rFonts w:cs="Times New Roman"/>
+          <w:color w:val="000000" w:themeColor="text1"/>
+          <w:szCs w:val="28"/>
+        </w:rPr>
+      </w:pPr>
+      <w:r>
+        <w:rPr>
+          <w:rFonts w:cs="Times New Roman"/>
+          <w:color w:val="000000" w:themeColor="text1"/>
           <w:szCs w:val="28"/>
         </w:rPr>
         <w:t>– Hai bên cam kết thực hiện đúng các thỏa thuận đã quy định tại Hợp đồng này.</w:t>
@@ -1131,6 +1199,7 @@
           <w:rFonts w:cs="Times New Roman"/>
           <w:b/>
           <w:bCs/>
+          <w:color w:val="000000" w:themeColor="text1"/>
           <w:szCs w:val="28"/>
         </w:rPr>
       </w:pPr>
@@ -1139,6 +1208,7 @@
           <w:rFonts w:cs="Times New Roman"/>
           <w:b/>
           <w:bCs/>
+          <w:color w:val="000000" w:themeColor="text1"/>
           <w:szCs w:val="28"/>
         </w:rPr>
         <w:t>ĐIỀU 5: GIẢI QUYẾT TRANH CHẤP</w:t>
@@ -1148,12 +1218,14 @@
       <w:pPr>
         <w:rPr>
           <w:rFonts w:cs="Times New Roman"/>
-          <w:szCs w:val="28"/>
-        </w:rPr>
-      </w:pPr>
-      <w:r>
-        <w:rPr>
-          <w:rFonts w:cs="Times New Roman"/>
+          <w:color w:val="000000" w:themeColor="text1"/>
+          <w:szCs w:val="28"/>
+        </w:rPr>
+      </w:pPr>
+      <w:r>
+        <w:rPr>
+          <w:rFonts w:cs="Times New Roman"/>
+          <w:color w:val="000000" w:themeColor="text1"/>
           <w:szCs w:val="28"/>
         </w:rPr>
         <w:t>Trường hợp các bên có tranh chấp về các nội dung của hợp đồng này thì hai bên cùng bàn bạc giải quyết thông qua thương lượng. Trong trường hợp các bên không thương lượng được thì một trong hai bên có quyền yêu cầu Tòa án nhân dân giải quyết theo quy định của pháp luật.</w:t>
@@ -1165,6 +1237,7 @@
           <w:rFonts w:cs="Times New Roman"/>
           <w:b/>
           <w:bCs/>
+          <w:color w:val="000000" w:themeColor="text1"/>
           <w:szCs w:val="28"/>
         </w:rPr>
       </w:pPr>
@@ -1173,29 +1246,42 @@
           <w:rFonts w:cs="Times New Roman"/>
           <w:b/>
           <w:bCs/>
+          <w:color w:val="000000" w:themeColor="text1"/>
           <w:szCs w:val="28"/>
         </w:rPr>
         <w:t>ĐIỀU 6: HIỆU LỰC CỦA HỢP ĐỒNG</w:t>
       </w:r>
     </w:p>
     <w:p>
-      <w:r>
-        <w:rPr>
-          <w:rFonts w:cs="Times New Roman"/>
+      <w:pPr>
+        <w:rPr>
+          <w:color w:val="000000" w:themeColor="text1"/>
+        </w:rPr>
+      </w:pPr>
+      <w:r>
+        <w:rPr>
+          <w:rFonts w:cs="Times New Roman"/>
+          <w:color w:val="000000" w:themeColor="text1"/>
           <w:szCs w:val="28"/>
         </w:rPr>
         <w:t>– Hợp đồng này có hiệu lực kể từ</w:t>
       </w:r>
       <w:r>
+        <w:rPr>
+          <w:color w:val="000000" w:themeColor="text1"/>
+        </w:rPr>
         <w:t xml:space="preserve"> </w:t>
       </w:r>
       <w:sdt>
         <w:sdtPr>
+          <w:rPr>
+            <w:color w:val="000000" w:themeColor="text1"/>
+          </w:rPr>
           <w:alias w:val="start_date"/>
           <w:tag w:val="text"/>
-          <w:id w:val="854690977"/>
+          <w:id w:val="414754427"/>
           <w:placeholder>
-            <w:docPart w:val="4D0E9499D7914A01864FB8A78CA91B1D"/>
+            <w:docPart w:val="1F3F82669AE341D18ABB707730240BB4"/>
           </w:placeholder>
           <w:showingPlcHdr/>
           <w:text/>
@@ -1204,6 +1290,7 @@
           <w:r>
             <w:rPr>
               <w:rStyle w:val="PlaceholderText"/>
+              <w:color w:val="000000" w:themeColor="text1"/>
             </w:rPr>
             <w:t>Click or tap here to enter text.</w:t>
           </w:r>
@@ -1211,48 +1298,38 @@
       </w:sdt>
     </w:p>
     <w:p>
-      <w:r>
-        <w:rPr>
-          <w:rFonts w:cs="Times New Roman"/>
+      <w:pPr>
+        <w:rPr>
+          <w:color w:val="000000" w:themeColor="text1"/>
+        </w:rPr>
+      </w:pPr>
+      <w:r>
+        <w:rPr>
+          <w:rFonts w:cs="Times New Roman"/>
+          <w:color w:val="000000" w:themeColor="text1"/>
           <w:szCs w:val="28"/>
         </w:rPr>
         <w:t xml:space="preserve">– </w:t>
       </w:r>
       <w:r>
-        <w:t xml:space="preserve">Hợp đồng này được lập thành </w:t>
-      </w:r>
-      <w:r>
-        <w:t>3</w:t>
-      </w:r>
-      <w:r>
-        <w:t xml:space="preserve"> bản và có giá trị như nhau. Mỗi bên giữ </w:t>
-      </w:r>
-      <w:r>
-        <w:t>1</w:t>
-      </w:r>
-      <w:r>
-        <w:t xml:space="preserve"> bản, </w:t>
-      </w:r>
-      <w:r>
-        <w:t>1</w:t>
-      </w:r>
-      <w:r>
-        <w:t xml:space="preserve"> bản lưu tại cơ quan công chứng hoặc chứng thực</w:t>
-      </w:r>
-      <w:r>
-        <w:t>.</w:t>
-      </w:r>
-    </w:p>
-    <w:p>
-      <w:pPr>
-        <w:rPr>
-          <w:rFonts w:cs="Times New Roman"/>
-          <w:szCs w:val="28"/>
-        </w:rPr>
-      </w:pPr>
-      <w:r>
-        <w:rPr>
-          <w:rFonts w:cs="Times New Roman"/>
+        <w:rPr>
+          <w:color w:val="000000" w:themeColor="text1"/>
+        </w:rPr>
+        <w:t>Hợp đồng này được lập thành 3 bản và có giá trị như nhau. Mỗi bên giữ 1 bản, 1 bản lưu tại cơ quan công chứng hoặc chứng thực.</w:t>
+      </w:r>
+    </w:p>
+    <w:p>
+      <w:pPr>
+        <w:rPr>
+          <w:rFonts w:cs="Times New Roman"/>
+          <w:color w:val="000000" w:themeColor="text1"/>
+          <w:szCs w:val="28"/>
+        </w:rPr>
+      </w:pPr>
+      <w:r>
+        <w:rPr>
+          <w:rFonts w:cs="Times New Roman"/>
+          <w:color w:val="000000" w:themeColor="text1"/>
           <w:szCs w:val="28"/>
         </w:rPr>
         <w:t>BÊN MUA (BÊN B)                                                            BÊN BÁN (BÊN A)</w:t>
@@ -1262,6 +1339,7 @@
       <w:pPr>
         <w:rPr>
           <w:rFonts w:cs="Times New Roman"/>
+          <w:color w:val="000000" w:themeColor="text1"/>
           <w:szCs w:val="28"/>
         </w:rPr>
       </w:pPr>
@@ -1270,6 +1348,7 @@
           <w:rFonts w:cs="Times New Roman"/>
           <w:i/>
           <w:iCs/>
+          <w:color w:val="000000" w:themeColor="text1"/>
           <w:szCs w:val="28"/>
         </w:rPr>
         <w:t>(Ký và ghi rõ họ tên)                                                           (Ký và ghi rõ họ tên)</w:t>
@@ -1279,7 +1358,15 @@
       <w:pPr>
         <w:rPr>
           <w:rFonts w:cs="Times New Roman"/>
-          <w:szCs w:val="28"/>
+          <w:color w:val="000000" w:themeColor="text1"/>
+          <w:szCs w:val="28"/>
+        </w:rPr>
+      </w:pPr>
+    </w:p>
+    <w:p>
+      <w:pPr>
+        <w:rPr>
+          <w:color w:val="000000" w:themeColor="text1"/>
         </w:rPr>
       </w:pPr>
     </w:p>
@@ -1291,127 +1378,6 @@
     </w:sectPr>
   </w:body>
 </w:document>
-</file>
-
-<file path=word/numbering.xml><?xml version="1.0" encoding="utf-8"?>
-<w:numbering xmlns:wpc="http://schemas.microsoft.com/office/word/2010/wordprocessingCanvas" xmlns:cx="http://schemas.microsoft.com/office/drawing/2014/chartex" xmlns:cx1="http://schemas.microsoft.com/office/drawing/2015/9/8/chartex" xmlns:cx2="http://schemas.microsoft.com/office/drawing/2015/10/21/chartex" xmlns:cx3="http://schemas.microsoft.com/office/drawing/2016/5/9/chartex" xmlns:cx4="http://schemas.microsoft.com/office/drawing/2016/5/10/chartex" xmlns:cx5="http://schemas.microsoft.com/office/drawing/2016/5/11/chartex" xmlns:cx6="http://schemas.microsoft.com/office/drawing/2016/5/12/chartex" xmlns:cx7="http://schemas.microsoft.com/office/drawing/2016/5/13/chartex" xmlns:cx8="http://schemas.microsoft.com/office/drawing/2016/5/14/chartex" xmlns:mc="http://schemas.openxmlformats.org/markup-compatibility/2006" xmlns:aink="http://schemas.microsoft.com/office/drawing/2016/ink" xmlns:am3d="http://schemas.microsoft.com/office/drawing/2017/model3d" xmlns:o="urn:schemas-microsoft-com:office:office" xmlns:oel="http://schemas.microsoft.com/office/2019/extlst" xmlns:r="http://schemas.openxmlformats.org/officeDocument/2006/relationships" xmlns:m="http://schemas.openxmlformats.org/officeDocument/2006/math" xmlns:v="urn:schemas-microsoft-com:vml" xmlns:wp14="http://schemas.microsoft.com/office/word/2010/wordprocessingDrawing" xmlns:wp="http://schemas.openxmlformats.org/drawingml/2006/wordprocessingDrawing" xmlns:w10="urn:schemas-microsoft-com:office:word" xmlns:w="http://schemas.openxmlformats.org/wordprocessingml/2006/main" xmlns:w14="http://schemas.microsoft.com/office/word/2010/wordml" xmlns:w15="http://schemas.microsoft.com/office/word/2012/wordml" xmlns:w16cex="http://schemas.microsoft.com/office/word/2018/wordml/cex" xmlns:w16cid="http://schemas.microsoft.com/office/word/2016/wordml/cid" xmlns:w16="http://schemas.microsoft.com/office/word/2018/wordml" xmlns:w16du="http://schemas.microsoft.com/office/word/2023/wordml/word16du" xmlns:w16sdtdh="http://schemas.microsoft.com/office/word/2020/wordml/sdtdatahash" xmlns:w16sdtfl="http://schemas.microsoft.com/office/word/2024/wordml/sdtformatlock" xmlns:w16se="http://schemas.microsoft.com/office/word/2015/wordml/symex" xmlns:wpg="http://schemas.microsoft.com/office/word/2010/wordprocessingGroup" xmlns:wpi="http://schemas.microsoft.com/office/word/2010/wordprocessingInk" xmlns:wne="http://schemas.microsoft.com/office/word/2006/wordml" xmlns:wps="http://schemas.microsoft.com/office/word/2010/wordprocessingShape" mc:Ignorable="w14 w15 w16se w16cid w16 w16cex w16sdtdh w16sdtfl w16du wp14">
-  <w:abstractNum w:abstractNumId="0" w15:restartNumberingAfterBreak="0">
-    <w:nsid w:val="30296162"/>
-    <w:multiLevelType w:val="hybridMultilevel"/>
-    <w:tmpl w:val="6CF45B78"/>
-    <w:lvl w:ilvl="0" w:tplc="2CF05DBC">
-      <w:start w:val="2"/>
-      <w:numFmt w:val="bullet"/>
-      <w:lvlText w:val="-"/>
-      <w:lvlJc w:val="left"/>
-      <w:pPr>
-        <w:ind w:left="720" w:hanging="360"/>
-      </w:pPr>
-      <w:rPr>
-        <w:rFonts w:ascii="Times New Roman" w:eastAsiaTheme="minorHAnsi" w:hAnsi="Times New Roman" w:cs="Times New Roman" w:hint="default"/>
-      </w:rPr>
-    </w:lvl>
-    <w:lvl w:ilvl="1" w:tplc="04090003" w:tentative="1">
-      <w:start w:val="1"/>
-      <w:numFmt w:val="bullet"/>
-      <w:lvlText w:val="o"/>
-      <w:lvlJc w:val="left"/>
-      <w:pPr>
-        <w:ind w:left="1440" w:hanging="360"/>
-      </w:pPr>
-      <w:rPr>
-        <w:rFonts w:ascii="Courier New" w:hAnsi="Courier New" w:cs="Courier New" w:hint="default"/>
-      </w:rPr>
-    </w:lvl>
-    <w:lvl w:ilvl="2" w:tplc="04090005" w:tentative="1">
-      <w:start w:val="1"/>
-      <w:numFmt w:val="bullet"/>
-      <w:lvlText w:val=""/>
-      <w:lvlJc w:val="left"/>
-      <w:pPr>
-        <w:ind w:left="2160" w:hanging="360"/>
-      </w:pPr>
-      <w:rPr>
-        <w:rFonts w:ascii="Wingdings" w:hAnsi="Wingdings" w:hint="default"/>
-      </w:rPr>
-    </w:lvl>
-    <w:lvl w:ilvl="3" w:tplc="04090001" w:tentative="1">
-      <w:start w:val="1"/>
-      <w:numFmt w:val="bullet"/>
-      <w:lvlText w:val=""/>
-      <w:lvlJc w:val="left"/>
-      <w:pPr>
-        <w:ind w:left="2880" w:hanging="360"/>
-      </w:pPr>
-      <w:rPr>
-        <w:rFonts w:ascii="Symbol" w:hAnsi="Symbol" w:hint="default"/>
-      </w:rPr>
-    </w:lvl>
-    <w:lvl w:ilvl="4" w:tplc="04090003" w:tentative="1">
-      <w:start w:val="1"/>
-      <w:numFmt w:val="bullet"/>
-      <w:lvlText w:val="o"/>
-      <w:lvlJc w:val="left"/>
-      <w:pPr>
-        <w:ind w:left="3600" w:hanging="360"/>
-      </w:pPr>
-      <w:rPr>
-        <w:rFonts w:ascii="Courier New" w:hAnsi="Courier New" w:cs="Courier New" w:hint="default"/>
-      </w:rPr>
-    </w:lvl>
-    <w:lvl w:ilvl="5" w:tplc="04090005" w:tentative="1">
-      <w:start w:val="1"/>
-      <w:numFmt w:val="bullet"/>
-      <w:lvlText w:val=""/>
-      <w:lvlJc w:val="left"/>
-      <w:pPr>
-        <w:ind w:left="4320" w:hanging="360"/>
-      </w:pPr>
-      <w:rPr>
-        <w:rFonts w:ascii="Wingdings" w:hAnsi="Wingdings" w:hint="default"/>
-      </w:rPr>
-    </w:lvl>
-    <w:lvl w:ilvl="6" w:tplc="04090001" w:tentative="1">
-      <w:start w:val="1"/>
-      <w:numFmt w:val="bullet"/>
-      <w:lvlText w:val=""/>
-      <w:lvlJc w:val="left"/>
-      <w:pPr>
-        <w:ind w:left="5040" w:hanging="360"/>
-      </w:pPr>
-      <w:rPr>
-        <w:rFonts w:ascii="Symbol" w:hAnsi="Symbol" w:hint="default"/>
-      </w:rPr>
-    </w:lvl>
-    <w:lvl w:ilvl="7" w:tplc="04090003" w:tentative="1">
-      <w:start w:val="1"/>
-      <w:numFmt w:val="bullet"/>
-      <w:lvlText w:val="o"/>
-      <w:lvlJc w:val="left"/>
-      <w:pPr>
-        <w:ind w:left="5760" w:hanging="360"/>
-      </w:pPr>
-      <w:rPr>
-        <w:rFonts w:ascii="Courier New" w:hAnsi="Courier New" w:cs="Courier New" w:hint="default"/>
-      </w:rPr>
-    </w:lvl>
-    <w:lvl w:ilvl="8" w:tplc="04090005" w:tentative="1">
-      <w:start w:val="1"/>
-      <w:numFmt w:val="bullet"/>
-      <w:lvlText w:val=""/>
-      <w:lvlJc w:val="left"/>
-      <w:pPr>
-        <w:ind w:left="6480" w:hanging="360"/>
-      </w:pPr>
-      <w:rPr>
-        <w:rFonts w:ascii="Wingdings" w:hAnsi="Wingdings" w:hint="default"/>
-      </w:rPr>
-    </w:lvl>
-  </w:abstractNum>
-  <w:num w:numId="1" w16cid:durableId="990598002">
-    <w:abstractNumId w:val="0"/>
-  </w:num>
-</w:numbering>
 </file>
 
 <file path=word/styles.xml><?xml version="1.0" encoding="utf-8"?>
@@ -1814,7 +1780,7 @@
   <w:style w:type="paragraph" w:default="1" w:styleId="Normal">
     <w:name w:val="Normal"/>
     <w:qFormat/>
-    <w:rsid w:val="00B61B88"/>
+    <w:rsid w:val="00142D56"/>
   </w:style>
   <w:style w:type="paragraph" w:styleId="Heading1">
     <w:name w:val="heading 1"/>
@@ -1823,7 +1789,7 @@
     <w:link w:val="Heading1Char"/>
     <w:uiPriority w:val="9"/>
     <w:qFormat/>
-    <w:rsid w:val="00707A3D"/>
+    <w:rsid w:val="00142D56"/>
     <w:pPr>
       <w:keepNext/>
       <w:keepLines/>
@@ -1846,7 +1812,7 @@
     <w:semiHidden/>
     <w:unhideWhenUsed/>
     <w:qFormat/>
-    <w:rsid w:val="00707A3D"/>
+    <w:rsid w:val="00142D56"/>
     <w:pPr>
       <w:keepNext/>
       <w:keepLines/>
@@ -1869,7 +1835,7 @@
     <w:semiHidden/>
     <w:unhideWhenUsed/>
     <w:qFormat/>
-    <w:rsid w:val="00707A3D"/>
+    <w:rsid w:val="00142D56"/>
     <w:pPr>
       <w:keepNext/>
       <w:keepLines/>
@@ -1891,7 +1857,7 @@
     <w:semiHidden/>
     <w:unhideWhenUsed/>
     <w:qFormat/>
-    <w:rsid w:val="00707A3D"/>
+    <w:rsid w:val="00142D56"/>
     <w:pPr>
       <w:keepNext/>
       <w:keepLines/>
@@ -1914,7 +1880,7 @@
     <w:semiHidden/>
     <w:unhideWhenUsed/>
     <w:qFormat/>
-    <w:rsid w:val="00707A3D"/>
+    <w:rsid w:val="00142D56"/>
     <w:pPr>
       <w:keepNext/>
       <w:keepLines/>
@@ -1935,7 +1901,7 @@
     <w:semiHidden/>
     <w:unhideWhenUsed/>
     <w:qFormat/>
-    <w:rsid w:val="00707A3D"/>
+    <w:rsid w:val="00142D56"/>
     <w:pPr>
       <w:keepNext/>
       <w:keepLines/>
@@ -1958,7 +1924,7 @@
     <w:semiHidden/>
     <w:unhideWhenUsed/>
     <w:qFormat/>
-    <w:rsid w:val="00707A3D"/>
+    <w:rsid w:val="00142D56"/>
     <w:pPr>
       <w:keepNext/>
       <w:keepLines/>
@@ -1979,7 +1945,7 @@
     <w:semiHidden/>
     <w:unhideWhenUsed/>
     <w:qFormat/>
-    <w:rsid w:val="00707A3D"/>
+    <w:rsid w:val="00142D56"/>
     <w:pPr>
       <w:keepNext/>
       <w:keepLines/>
@@ -2002,7 +1968,7 @@
     <w:semiHidden/>
     <w:unhideWhenUsed/>
     <w:qFormat/>
-    <w:rsid w:val="00707A3D"/>
+    <w:rsid w:val="00142D56"/>
     <w:pPr>
       <w:keepNext/>
       <w:keepLines/>
@@ -2046,7 +2012,7 @@
     <w:basedOn w:val="DefaultParagraphFont"/>
     <w:link w:val="Heading1"/>
     <w:uiPriority w:val="9"/>
-    <w:rsid w:val="00707A3D"/>
+    <w:rsid w:val="00142D56"/>
     <w:rPr>
       <w:rFonts w:asciiTheme="majorHAnsi" w:eastAsiaTheme="majorEastAsia" w:hAnsiTheme="majorHAnsi" w:cstheme="majorBidi"/>
       <w:color w:val="2F5496" w:themeColor="accent1" w:themeShade="BF"/>
@@ -2060,7 +2026,7 @@
     <w:link w:val="Heading2"/>
     <w:uiPriority w:val="9"/>
     <w:semiHidden/>
-    <w:rsid w:val="00707A3D"/>
+    <w:rsid w:val="00142D56"/>
     <w:rPr>
       <w:rFonts w:asciiTheme="majorHAnsi" w:eastAsiaTheme="majorEastAsia" w:hAnsiTheme="majorHAnsi" w:cstheme="majorBidi"/>
       <w:color w:val="2F5496" w:themeColor="accent1" w:themeShade="BF"/>
@@ -2074,7 +2040,7 @@
     <w:link w:val="Heading3"/>
     <w:uiPriority w:val="9"/>
     <w:semiHidden/>
-    <w:rsid w:val="00707A3D"/>
+    <w:rsid w:val="00142D56"/>
     <w:rPr>
       <w:rFonts w:asciiTheme="minorHAnsi" w:eastAsiaTheme="majorEastAsia" w:hAnsiTheme="minorHAnsi" w:cstheme="majorBidi"/>
       <w:color w:val="2F5496" w:themeColor="accent1" w:themeShade="BF"/>
@@ -2087,7 +2053,7 @@
     <w:link w:val="Heading4"/>
     <w:uiPriority w:val="9"/>
     <w:semiHidden/>
-    <w:rsid w:val="00707A3D"/>
+    <w:rsid w:val="00142D56"/>
     <w:rPr>
       <w:rFonts w:asciiTheme="minorHAnsi" w:eastAsiaTheme="majorEastAsia" w:hAnsiTheme="minorHAnsi" w:cstheme="majorBidi"/>
       <w:i/>
@@ -2101,7 +2067,7 @@
     <w:link w:val="Heading5"/>
     <w:uiPriority w:val="9"/>
     <w:semiHidden/>
-    <w:rsid w:val="00707A3D"/>
+    <w:rsid w:val="00142D56"/>
     <w:rPr>
       <w:rFonts w:asciiTheme="minorHAnsi" w:eastAsiaTheme="majorEastAsia" w:hAnsiTheme="minorHAnsi" w:cstheme="majorBidi"/>
       <w:color w:val="2F5496" w:themeColor="accent1" w:themeShade="BF"/>
@@ -2113,7 +2079,7 @@
     <w:link w:val="Heading6"/>
     <w:uiPriority w:val="9"/>
     <w:semiHidden/>
-    <w:rsid w:val="00707A3D"/>
+    <w:rsid w:val="00142D56"/>
     <w:rPr>
       <w:rFonts w:asciiTheme="minorHAnsi" w:eastAsiaTheme="majorEastAsia" w:hAnsiTheme="minorHAnsi" w:cstheme="majorBidi"/>
       <w:i/>
@@ -2127,7 +2093,7 @@
     <w:link w:val="Heading7"/>
     <w:uiPriority w:val="9"/>
     <w:semiHidden/>
-    <w:rsid w:val="00707A3D"/>
+    <w:rsid w:val="00142D56"/>
     <w:rPr>
       <w:rFonts w:asciiTheme="minorHAnsi" w:eastAsiaTheme="majorEastAsia" w:hAnsiTheme="minorHAnsi" w:cstheme="majorBidi"/>
       <w:color w:val="595959" w:themeColor="text1" w:themeTint="A6"/>
@@ -2139,7 +2105,7 @@
     <w:link w:val="Heading8"/>
     <w:uiPriority w:val="9"/>
     <w:semiHidden/>
-    <w:rsid w:val="00707A3D"/>
+    <w:rsid w:val="00142D56"/>
     <w:rPr>
       <w:rFonts w:asciiTheme="minorHAnsi" w:eastAsiaTheme="majorEastAsia" w:hAnsiTheme="minorHAnsi" w:cstheme="majorBidi"/>
       <w:i/>
@@ -2153,7 +2119,7 @@
     <w:link w:val="Heading9"/>
     <w:uiPriority w:val="9"/>
     <w:semiHidden/>
-    <w:rsid w:val="00707A3D"/>
+    <w:rsid w:val="00142D56"/>
     <w:rPr>
       <w:rFonts w:asciiTheme="minorHAnsi" w:eastAsiaTheme="majorEastAsia" w:hAnsiTheme="minorHAnsi" w:cstheme="majorBidi"/>
       <w:color w:val="272727" w:themeColor="text1" w:themeTint="D8"/>
@@ -2166,7 +2132,7 @@
     <w:link w:val="TitleChar"/>
     <w:uiPriority w:val="10"/>
     <w:qFormat/>
-    <w:rsid w:val="00707A3D"/>
+    <w:rsid w:val="00142D56"/>
     <w:pPr>
       <w:spacing w:after="80" w:line="240" w:lineRule="auto"/>
       <w:contextualSpacing/>
@@ -2184,7 +2150,7 @@
     <w:basedOn w:val="DefaultParagraphFont"/>
     <w:link w:val="Title"/>
     <w:uiPriority w:val="10"/>
-    <w:rsid w:val="00707A3D"/>
+    <w:rsid w:val="00142D56"/>
     <w:rPr>
       <w:rFonts w:asciiTheme="majorHAnsi" w:eastAsiaTheme="majorEastAsia" w:hAnsiTheme="majorHAnsi" w:cstheme="majorBidi"/>
       <w:spacing w:val="-10"/>
@@ -2200,7 +2166,7 @@
     <w:link w:val="SubtitleChar"/>
     <w:uiPriority w:val="11"/>
     <w:qFormat/>
-    <w:rsid w:val="00707A3D"/>
+    <w:rsid w:val="00142D56"/>
     <w:pPr>
       <w:numPr>
         <w:ilvl w:val="1"/>
@@ -2219,7 +2185,7 @@
     <w:basedOn w:val="DefaultParagraphFont"/>
     <w:link w:val="Subtitle"/>
     <w:uiPriority w:val="11"/>
-    <w:rsid w:val="00707A3D"/>
+    <w:rsid w:val="00142D56"/>
     <w:rPr>
       <w:rFonts w:asciiTheme="minorHAnsi" w:eastAsiaTheme="majorEastAsia" w:hAnsiTheme="minorHAnsi" w:cstheme="majorBidi"/>
       <w:color w:val="595959" w:themeColor="text1" w:themeTint="A6"/>
@@ -2234,7 +2200,7 @@
     <w:link w:val="QuoteChar"/>
     <w:uiPriority w:val="29"/>
     <w:qFormat/>
-    <w:rsid w:val="00707A3D"/>
+    <w:rsid w:val="00142D56"/>
     <w:pPr>
       <w:spacing w:before="160" w:after="160"/>
       <w:jc w:val="center"/>
@@ -2250,7 +2216,7 @@
     <w:basedOn w:val="DefaultParagraphFont"/>
     <w:link w:val="Quote"/>
     <w:uiPriority w:val="29"/>
-    <w:rsid w:val="00707A3D"/>
+    <w:rsid w:val="00142D56"/>
     <w:rPr>
       <w:i/>
       <w:iCs/>
@@ -2262,7 +2228,7 @@
     <w:basedOn w:val="Normal"/>
     <w:uiPriority w:val="34"/>
     <w:qFormat/>
-    <w:rsid w:val="00707A3D"/>
+    <w:rsid w:val="00142D56"/>
     <w:pPr>
       <w:ind w:left="720"/>
       <w:contextualSpacing/>
@@ -2273,7 +2239,7 @@
     <w:basedOn w:val="DefaultParagraphFont"/>
     <w:uiPriority w:val="21"/>
     <w:qFormat/>
-    <w:rsid w:val="00707A3D"/>
+    <w:rsid w:val="00142D56"/>
     <w:rPr>
       <w:i/>
       <w:iCs/>
@@ -2287,7 +2253,7 @@
     <w:link w:val="IntenseQuoteChar"/>
     <w:uiPriority w:val="30"/>
     <w:qFormat/>
-    <w:rsid w:val="00707A3D"/>
+    <w:rsid w:val="00142D56"/>
     <w:pPr>
       <w:pBdr>
         <w:top w:val="single" w:sz="4" w:space="10" w:color="2F5496" w:themeColor="accent1" w:themeShade="BF"/>
@@ -2308,7 +2274,7 @@
     <w:basedOn w:val="DefaultParagraphFont"/>
     <w:link w:val="IntenseQuote"/>
     <w:uiPriority w:val="30"/>
-    <w:rsid w:val="00707A3D"/>
+    <w:rsid w:val="00142D56"/>
     <w:rPr>
       <w:i/>
       <w:iCs/>
@@ -2320,7 +2286,7 @@
     <w:basedOn w:val="DefaultParagraphFont"/>
     <w:uiPriority w:val="32"/>
     <w:qFormat/>
-    <w:rsid w:val="00707A3D"/>
+    <w:rsid w:val="00142D56"/>
     <w:rPr>
       <w:b/>
       <w:bCs/>
@@ -2329,35 +2295,12 @@
       <w:spacing w:val="5"/>
     </w:rPr>
   </w:style>
-  <w:style w:type="character" w:styleId="Hyperlink">
-    <w:name w:val="Hyperlink"/>
-    <w:basedOn w:val="DefaultParagraphFont"/>
-    <w:uiPriority w:val="99"/>
-    <w:unhideWhenUsed/>
-    <w:rsid w:val="00707A3D"/>
-    <w:rPr>
-      <w:color w:val="0563C1" w:themeColor="hyperlink"/>
-      <w:u w:val="single"/>
-    </w:rPr>
-  </w:style>
-  <w:style w:type="character" w:styleId="UnresolvedMention">
-    <w:name w:val="Unresolved Mention"/>
-    <w:basedOn w:val="DefaultParagraphFont"/>
-    <w:uiPriority w:val="99"/>
-    <w:semiHidden/>
-    <w:unhideWhenUsed/>
-    <w:rsid w:val="00707A3D"/>
-    <w:rPr>
-      <w:color w:val="605E5C"/>
-      <w:shd w:val="clear" w:color="auto" w:fill="E1DFDD"/>
-    </w:rPr>
-  </w:style>
   <w:style w:type="character" w:styleId="PlaceholderText">
     <w:name w:val="Placeholder Text"/>
     <w:basedOn w:val="DefaultParagraphFont"/>
     <w:uiPriority w:val="99"/>
     <w:semiHidden/>
-    <w:rsid w:val="00E252BA"/>
+    <w:rsid w:val="00142D56"/>
     <w:rPr>
       <w:color w:val="666666"/>
     </w:rPr>
@@ -2368,6 +2311,36 @@
 <file path=word/glossary/document.xml><?xml version="1.0" encoding="utf-8"?>
 <w:glossaryDocument xmlns:wpc="http://schemas.microsoft.com/office/word/2010/wordprocessingCanvas" xmlns:cx="http://schemas.microsoft.com/office/drawing/2014/chartex" xmlns:cx1="http://schemas.microsoft.com/office/drawing/2015/9/8/chartex" xmlns:cx2="http://schemas.microsoft.com/office/drawing/2015/10/21/chartex" xmlns:cx3="http://schemas.microsoft.com/office/drawing/2016/5/9/chartex" xmlns:cx4="http://schemas.microsoft.com/office/drawing/2016/5/10/chartex" xmlns:cx5="http://schemas.microsoft.com/office/drawing/2016/5/11/chartex" xmlns:cx6="http://schemas.microsoft.com/office/drawing/2016/5/12/chartex" xmlns:cx7="http://schemas.microsoft.com/office/drawing/2016/5/13/chartex" xmlns:cx8="http://schemas.microsoft.com/office/drawing/2016/5/14/chartex" xmlns:mc="http://schemas.openxmlformats.org/markup-compatibility/2006" xmlns:aink="http://schemas.microsoft.com/office/drawing/2016/ink" xmlns:am3d="http://schemas.microsoft.com/office/drawing/2017/model3d" xmlns:o="urn:schemas-microsoft-com:office:office" xmlns:oel="http://schemas.microsoft.com/office/2019/extlst" xmlns:r="http://schemas.openxmlformats.org/officeDocument/2006/relationships" xmlns:m="http://schemas.openxmlformats.org/officeDocument/2006/math" xmlns:v="urn:schemas-microsoft-com:vml" xmlns:wp14="http://schemas.microsoft.com/office/word/2010/wordprocessingDrawing" xmlns:wp="http://schemas.openxmlformats.org/drawingml/2006/wordprocessingDrawing" xmlns:w10="urn:schemas-microsoft-com:office:word" xmlns:w="http://schemas.openxmlformats.org/wordprocessingml/2006/main" xmlns:w14="http://schemas.microsoft.com/office/word/2010/wordml" xmlns:w15="http://schemas.microsoft.com/office/word/2012/wordml" xmlns:w16cex="http://schemas.microsoft.com/office/word/2018/wordml/cex" xmlns:w16cid="http://schemas.microsoft.com/office/word/2016/wordml/cid" xmlns:w16="http://schemas.microsoft.com/office/word/2018/wordml" xmlns:w16du="http://schemas.microsoft.com/office/word/2023/wordml/word16du" xmlns:w16sdtdh="http://schemas.microsoft.com/office/word/2020/wordml/sdtdatahash" xmlns:w16sdtfl="http://schemas.microsoft.com/office/word/2024/wordml/sdtformatlock" xmlns:w16se="http://schemas.microsoft.com/office/word/2015/wordml/symex" xmlns:wpg="http://schemas.microsoft.com/office/word/2010/wordprocessingGroup" xmlns:wpi="http://schemas.microsoft.com/office/word/2010/wordprocessingInk" xmlns:wne="http://schemas.microsoft.com/office/word/2006/wordml" xmlns:wps="http://schemas.microsoft.com/office/word/2010/wordprocessingShape" mc:Ignorable="w14 w15 w16se w16cid w16 w16cex w16sdtdh w16sdtfl w16du wp14">
   <w:docParts>
+    <w:docPart>
+      <w:docPartPr>
+        <w:name w:val="853CF763377A45ACA4B289B8E4CE1FEC"/>
+        <w:category>
+          <w:name w:val="General"/>
+          <w:gallery w:val="placeholder"/>
+        </w:category>
+        <w:types>
+          <w:type w:val="bbPlcHdr"/>
+        </w:types>
+        <w:behaviors>
+          <w:behavior w:val="content"/>
+        </w:behaviors>
+        <w:guid w:val="{8891BDB4-55E1-430A-B651-18E2D53AAA91}"/>
+      </w:docPartPr>
+      <w:docPartBody>
+        <w:p>
+          <w:pPr>
+            <w:pStyle w:val="853CF763377A45ACA4B289B8E4CE1FEC3"/>
+          </w:pPr>
+          <w:r>
+            <w:rPr>
+              <w:rStyle w:val="PlaceholderText"/>
+              <w:color w:val="000000" w:themeColor="text1"/>
+            </w:rPr>
+            <w:t>Click or tap here to enter text.</w:t>
+          </w:r>
+        </w:p>
+      </w:docPartBody>
+    </w:docPart>
     <w:docPart>
       <w:docPartPr>
         <w:name w:val="DefaultPlaceholder_-1854013440"/>
@@ -2381,7 +2354,7 @@
         <w:behaviors>
           <w:behavior w:val="content"/>
         </w:behaviors>
-        <w:guid w:val="{B9FD0296-02A9-4499-98A0-B8392BF8E486}"/>
+        <w:guid w:val="{AE927D00-FDC1-4A35-B6A6-592D3078233C}"/>
       </w:docPartPr>
       <w:docPartBody>
         <w:p>
@@ -2396,7 +2369,7 @@
     </w:docPart>
     <w:docPart>
       <w:docPartPr>
-        <w:name w:val="4D0E9499D7914A01864FB8A78CA91B1D"/>
+        <w:name w:val="A2B922179FB34629AFC41165ECAD196E"/>
         <w:category>
           <w:name w:val="General"/>
           <w:gallery w:val="placeholder"/>
@@ -2407,16 +2380,17 @@
         <w:behaviors>
           <w:behavior w:val="content"/>
         </w:behaviors>
-        <w:guid w:val="{46BAB8F7-9C9B-47DF-9851-0AF140F4004D}"/>
+        <w:guid w:val="{71ED6387-9872-41CA-AF00-0D8BD49EFF2D}"/>
       </w:docPartPr>
       <w:docPartBody>
         <w:p>
           <w:pPr>
-            <w:pStyle w:val="4D0E9499D7914A01864FB8A78CA91B1D1"/>
+            <w:pStyle w:val="A2B922179FB34629AFC41165ECAD196E"/>
           </w:pPr>
           <w:r>
             <w:rPr>
               <w:rStyle w:val="PlaceholderText"/>
+              <w:color w:val="000000" w:themeColor="text1"/>
             </w:rPr>
             <w:t>Click or tap here to enter text.</w:t>
           </w:r>
@@ -2425,7 +2399,7 @@
     </w:docPart>
     <w:docPart>
       <w:docPartPr>
-        <w:name w:val="24CAD0A8F14F4B3E9AD64C05D0E31F76"/>
+        <w:name w:val="994D7BA1863F4C78B7EE7927865E1143"/>
         <w:category>
           <w:name w:val="General"/>
           <w:gallery w:val="placeholder"/>
@@ -2436,16 +2410,17 @@
         <w:behaviors>
           <w:behavior w:val="content"/>
         </w:behaviors>
-        <w:guid w:val="{B5E3C78C-4A12-4A7C-99E7-B47B10C54D4A}"/>
+        <w:guid w:val="{4EB5C8A4-A16C-4CB0-B6C8-1F7D184EECA0}"/>
       </w:docPartPr>
       <w:docPartBody>
         <w:p>
           <w:pPr>
-            <w:pStyle w:val="24CAD0A8F14F4B3E9AD64C05D0E31F761"/>
+            <w:pStyle w:val="994D7BA1863F4C78B7EE7927865E1143"/>
           </w:pPr>
           <w:r>
             <w:rPr>
               <w:rStyle w:val="PlaceholderText"/>
+              <w:color w:val="000000" w:themeColor="text1"/>
             </w:rPr>
             <w:t>Click or tap here to enter text.</w:t>
           </w:r>
@@ -2454,7 +2429,7 @@
     </w:docPart>
     <w:docPart>
       <w:docPartPr>
-        <w:name w:val="BC7BB2D302D045F180CC2A1E9F4D5CF9"/>
+        <w:name w:val="8B35AED859F9414BAE695BDF0831BDBE"/>
         <w:category>
           <w:name w:val="General"/>
           <w:gallery w:val="placeholder"/>
@@ -2465,16 +2440,17 @@
         <w:behaviors>
           <w:behavior w:val="content"/>
         </w:behaviors>
-        <w:guid w:val="{E9F7381D-FBBD-44AE-8549-6950E09A0F97}"/>
+        <w:guid w:val="{D4D7E6E9-8E72-4AEF-B077-BBE0C3EA73CD}"/>
       </w:docPartPr>
       <w:docPartBody>
         <w:p>
           <w:pPr>
-            <w:pStyle w:val="BC7BB2D302D045F180CC2A1E9F4D5CF91"/>
+            <w:pStyle w:val="8B35AED859F9414BAE695BDF0831BDBE3"/>
           </w:pPr>
           <w:r>
             <w:rPr>
               <w:rStyle w:val="PlaceholderText"/>
+              <w:color w:val="000000" w:themeColor="text1"/>
             </w:rPr>
             <w:t>Click or tap here to enter text.</w:t>
           </w:r>
@@ -2483,7 +2459,7 @@
     </w:docPart>
     <w:docPart>
       <w:docPartPr>
-        <w:name w:val="A0FE7D89F06E4EF494ECD88DA7769205"/>
+        <w:name w:val="A9BF5630463F462EA219286500D9DAF7"/>
         <w:category>
           <w:name w:val="General"/>
           <w:gallery w:val="placeholder"/>
@@ -2494,16 +2470,17 @@
         <w:behaviors>
           <w:behavior w:val="content"/>
         </w:behaviors>
-        <w:guid w:val="{439E97DB-37F9-4840-9AAE-A3BCD76D1BC1}"/>
+        <w:guid w:val="{B8DD5079-8E3E-4FC6-806D-FD63427FFCCB}"/>
       </w:docPartPr>
       <w:docPartBody>
         <w:p>
           <w:pPr>
-            <w:pStyle w:val="A0FE7D89F06E4EF494ECD88DA77692051"/>
+            <w:pStyle w:val="A9BF5630463F462EA219286500D9DAF71"/>
           </w:pPr>
           <w:r>
             <w:rPr>
               <w:rStyle w:val="PlaceholderText"/>
+              <w:color w:val="000000" w:themeColor="text1"/>
             </w:rPr>
             <w:t>Click or tap here to enter text.</w:t>
           </w:r>
@@ -2512,7 +2489,7 @@
     </w:docPart>
     <w:docPart>
       <w:docPartPr>
-        <w:name w:val="5513D8C4184E4EF086A4063A9D9C3764"/>
+        <w:name w:val="86A13E55BF6A4AC2828AE3B1758ACEFB"/>
         <w:category>
           <w:name w:val="General"/>
           <w:gallery w:val="placeholder"/>
@@ -2523,16 +2500,17 @@
         <w:behaviors>
           <w:behavior w:val="content"/>
         </w:behaviors>
-        <w:guid w:val="{C6689B1E-F96A-40DD-B1A9-19A292663002}"/>
+        <w:guid w:val="{7F549FE3-7031-42A4-893A-55C60FED4075}"/>
       </w:docPartPr>
       <w:docPartBody>
         <w:p>
           <w:pPr>
-            <w:pStyle w:val="5513D8C4184E4EF086A4063A9D9C37641"/>
+            <w:pStyle w:val="86A13E55BF6A4AC2828AE3B1758ACEFB1"/>
           </w:pPr>
           <w:r>
             <w:rPr>
               <w:rStyle w:val="PlaceholderText"/>
+              <w:color w:val="000000" w:themeColor="text1"/>
             </w:rPr>
             <w:t>Click or tap here to enter text.</w:t>
           </w:r>
@@ -2541,7 +2519,7 @@
     </w:docPart>
     <w:docPart>
       <w:docPartPr>
-        <w:name w:val="6D91F724CE09413C8E74B0808D21A35C"/>
+        <w:name w:val="E7101914D11D4BDC9DB6DE368C98B969"/>
         <w:category>
           <w:name w:val="General"/>
           <w:gallery w:val="placeholder"/>
@@ -2552,16 +2530,17 @@
         <w:behaviors>
           <w:behavior w:val="content"/>
         </w:behaviors>
-        <w:guid w:val="{2E5E5892-ABA9-4FEB-9F00-74EF43676B27}"/>
+        <w:guid w:val="{07B1B6CD-BCA5-4775-A8B3-D66DE1E2A9EC}"/>
       </w:docPartPr>
       <w:docPartBody>
         <w:p>
           <w:pPr>
-            <w:pStyle w:val="6D91F724CE09413C8E74B0808D21A35C5"/>
+            <w:pStyle w:val="E7101914D11D4BDC9DB6DE368C98B9691"/>
           </w:pPr>
           <w:r>
             <w:rPr>
               <w:rStyle w:val="PlaceholderText"/>
+              <w:color w:val="000000" w:themeColor="text1"/>
             </w:rPr>
             <w:t>Click or tap here to enter text.</w:t>
           </w:r>
@@ -2570,7 +2549,7 @@
     </w:docPart>
     <w:docPart>
       <w:docPartPr>
-        <w:name w:val="451C46F0BB8043BFBBE82278A3D4C16E"/>
+        <w:name w:val="5B6DF39B40544798AB737C73C0351438"/>
         <w:category>
           <w:name w:val="General"/>
           <w:gallery w:val="placeholder"/>
@@ -2581,16 +2560,17 @@
         <w:behaviors>
           <w:behavior w:val="content"/>
         </w:behaviors>
-        <w:guid w:val="{D792EE43-E841-4189-8367-11F007E1499D}"/>
+        <w:guid w:val="{FDFD43DE-B3FA-402F-A2ED-B50A1660A8C0}"/>
       </w:docPartPr>
       <w:docPartBody>
         <w:p>
           <w:pPr>
-            <w:pStyle w:val="451C46F0BB8043BFBBE82278A3D4C16E5"/>
+            <w:pStyle w:val="5B6DF39B40544798AB737C73C03514381"/>
           </w:pPr>
           <w:r>
             <w:rPr>
               <w:rStyle w:val="PlaceholderText"/>
+              <w:color w:val="000000" w:themeColor="text1"/>
             </w:rPr>
             <w:t>Click or tap here to enter text.</w:t>
           </w:r>
@@ -2599,7 +2579,7 @@
     </w:docPart>
     <w:docPart>
       <w:docPartPr>
-        <w:name w:val="70F6A5F631E447078C89BDF3F5458EB5"/>
+        <w:name w:val="4A3EB98DE1EB4BA6A2F51900886A6B33"/>
         <w:category>
           <w:name w:val="General"/>
           <w:gallery w:val="placeholder"/>
@@ -2610,16 +2590,17 @@
         <w:behaviors>
           <w:behavior w:val="content"/>
         </w:behaviors>
-        <w:guid w:val="{2231E0E5-C2EC-4865-AF67-F14159205CEC}"/>
+        <w:guid w:val="{1615DE19-8A6F-4E49-ACAB-BAB7762DEAAD}"/>
       </w:docPartPr>
       <w:docPartBody>
         <w:p>
           <w:pPr>
-            <w:pStyle w:val="70F6A5F631E447078C89BDF3F5458EB51"/>
+            <w:pStyle w:val="4A3EB98DE1EB4BA6A2F51900886A6B331"/>
           </w:pPr>
           <w:r>
             <w:rPr>
               <w:rStyle w:val="PlaceholderText"/>
+              <w:color w:val="000000" w:themeColor="text1"/>
             </w:rPr>
             <w:t>Click or tap here to enter text.</w:t>
           </w:r>
@@ -2628,7 +2609,7 @@
     </w:docPart>
     <w:docPart>
       <w:docPartPr>
-        <w:name w:val="F1BE0A69C7ED4A6C98CD4C369DD84B24"/>
+        <w:name w:val="1F3F82669AE341D18ABB707730240BB4"/>
         <w:category>
           <w:name w:val="General"/>
           <w:gallery w:val="placeholder"/>
@@ -2639,45 +2620,17 @@
         <w:behaviors>
           <w:behavior w:val="content"/>
         </w:behaviors>
-        <w:guid w:val="{68228638-FB4A-4757-957D-4892E04D74FE}"/>
+        <w:guid w:val="{C8446A6C-51A1-49A0-A007-D815C8C5578E}"/>
       </w:docPartPr>
       <w:docPartBody>
         <w:p>
           <w:pPr>
-            <w:pStyle w:val="F1BE0A69C7ED4A6C98CD4C369DD84B241"/>
+            <w:pStyle w:val="1F3F82669AE341D18ABB707730240BB41"/>
           </w:pPr>
           <w:r>
             <w:rPr>
               <w:rStyle w:val="PlaceholderText"/>
-            </w:rPr>
-            <w:t>Click or tap here to enter text.</w:t>
-          </w:r>
-        </w:p>
-      </w:docPartBody>
-    </w:docPart>
-    <w:docPart>
-      <w:docPartPr>
-        <w:name w:val="DE76DF7444E84A889BAB0FC407FEB17D"/>
-        <w:category>
-          <w:name w:val="General"/>
-          <w:gallery w:val="placeholder"/>
-        </w:category>
-        <w:types>
-          <w:type w:val="bbPlcHdr"/>
-        </w:types>
-        <w:behaviors>
-          <w:behavior w:val="content"/>
-        </w:behaviors>
-        <w:guid w:val="{DF42E6FE-B80B-4DA3-BA0B-BFDD78BE6BD7}"/>
-      </w:docPartPr>
-      <w:docPartBody>
-        <w:p>
-          <w:pPr>
-            <w:pStyle w:val="DE76DF7444E84A889BAB0FC407FEB17D"/>
-          </w:pPr>
-          <w:r>
-            <w:rPr>
-              <w:rStyle w:val="PlaceholderText"/>
+              <w:color w:val="000000" w:themeColor="text1"/>
             </w:rPr>
             <w:t>Click or tap here to enter text.</w:t>
           </w:r>
@@ -2704,27 +2657,6 @@
     <w:pitch w:val="variable"/>
     <w:sig w:usb0="E4002EFF" w:usb1="C000247B" w:usb2="00000009" w:usb3="00000000" w:csb0="000001FF" w:csb1="00000000"/>
   </w:font>
-  <w:font w:name="Courier New">
-    <w:panose1 w:val="02070309020205020404"/>
-    <w:charset w:val="00"/>
-    <w:family w:val="modern"/>
-    <w:pitch w:val="fixed"/>
-    <w:sig w:usb0="E0002EFF" w:usb1="C0007843" w:usb2="00000009" w:usb3="00000000" w:csb0="000001FF" w:csb1="00000000"/>
-  </w:font>
-  <w:font w:name="Wingdings">
-    <w:panose1 w:val="05000000000000000000"/>
-    <w:charset w:val="02"/>
-    <w:family w:val="auto"/>
-    <w:pitch w:val="variable"/>
-    <w:sig w:usb0="00000000" w:usb1="10000000" w:usb2="00000000" w:usb3="00000000" w:csb0="80000000" w:csb1="00000000"/>
-  </w:font>
-  <w:font w:name="Symbol">
-    <w:panose1 w:val="05050102010706020507"/>
-    <w:charset w:val="02"/>
-    <w:family w:val="roman"/>
-    <w:pitch w:val="variable"/>
-    <w:sig w:usb0="00000000" w:usb1="10000000" w:usb2="00000000" w:usb3="00000000" w:csb0="80000000" w:csb1="00000000"/>
-  </w:font>
   <w:font w:name="Calibri Light">
     <w:panose1 w:val="020F0302020204030204"/>
     <w:charset w:val="00"/>
@@ -2750,17 +2682,31 @@
     <w:compatSetting w:name="useWord2013TrackBottomHyphenation" w:uri="http://schemas.microsoft.com/office/word" w:val="0"/>
   </w:compat>
   <w:rsids>
-    <w:rsidRoot w:val="0098043D"/>
-    <w:rsid w:val="00056607"/>
-    <w:rsid w:val="00395996"/>
-    <w:rsid w:val="003D5808"/>
-    <w:rsid w:val="003F05A7"/>
-    <w:rsid w:val="004072A0"/>
-    <w:rsid w:val="00646A83"/>
-    <w:rsid w:val="0098043D"/>
-    <w:rsid w:val="00A95E4E"/>
-    <w:rsid w:val="00D85BB1"/>
-    <w:rsid w:val="00F87490"/>
+    <w:rsidRoot w:val="00766937"/>
+    <w:rsid w:val="000A6230"/>
+    <w:rsid w:val="001700F8"/>
+    <w:rsid w:val="00235D53"/>
+    <w:rsid w:val="002A1F0E"/>
+    <w:rsid w:val="002D41B0"/>
+    <w:rsid w:val="00317D31"/>
+    <w:rsid w:val="00353907"/>
+    <w:rsid w:val="003C235D"/>
+    <w:rsid w:val="0045031D"/>
+    <w:rsid w:val="005D27E9"/>
+    <w:rsid w:val="005D4B72"/>
+    <w:rsid w:val="00602C3A"/>
+    <w:rsid w:val="00613085"/>
+    <w:rsid w:val="006E2690"/>
+    <w:rsid w:val="00761948"/>
+    <w:rsid w:val="00766937"/>
+    <w:rsid w:val="00792427"/>
+    <w:rsid w:val="007F757B"/>
+    <w:rsid w:val="00980708"/>
+    <w:rsid w:val="00C444E6"/>
+    <w:rsid w:val="00D119EC"/>
+    <w:rsid w:val="00D143CE"/>
+    <w:rsid w:val="00E67A5A"/>
+    <w:rsid w:val="00E80F6E"/>
   </w:rsids>
   <m:mathPr>
     <m:mathFont m:val="Cambria Math"/>
@@ -3216,14 +3162,14 @@
     <w:basedOn w:val="DefaultParagraphFont"/>
     <w:uiPriority w:val="99"/>
     <w:semiHidden/>
-    <w:rsid w:val="00A95E4E"/>
+    <w:rsid w:val="00792427"/>
     <w:rPr>
       <w:color w:val="666666"/>
     </w:rPr>
   </w:style>
-  <w:style w:type="paragraph" w:customStyle="1" w:styleId="6D91F724CE09413C8E74B0808D21A35C5">
-    <w:name w:val="6D91F724CE09413C8E74B0808D21A35C5"/>
-    <w:rsid w:val="00A95E4E"/>
+  <w:style w:type="paragraph" w:customStyle="1" w:styleId="8B35AED859F9414BAE695BDF0831BDBE3">
+    <w:name w:val="8B35AED859F9414BAE695BDF0831BDBE3"/>
+    <w:rsid w:val="00792427"/>
     <w:pPr>
       <w:spacing w:after="120" w:line="360" w:lineRule="auto"/>
     </w:pPr>
@@ -3233,9 +3179,9 @@
       <w:szCs w:val="22"/>
     </w:rPr>
   </w:style>
-  <w:style w:type="paragraph" w:customStyle="1" w:styleId="451C46F0BB8043BFBBE82278A3D4C16E5">
-    <w:name w:val="451C46F0BB8043BFBBE82278A3D4C16E5"/>
-    <w:rsid w:val="00A95E4E"/>
+  <w:style w:type="paragraph" w:customStyle="1" w:styleId="853CF763377A45ACA4B289B8E4CE1FEC3">
+    <w:name w:val="853CF763377A45ACA4B289B8E4CE1FEC3"/>
+    <w:rsid w:val="00792427"/>
     <w:pPr>
       <w:spacing w:after="120" w:line="360" w:lineRule="auto"/>
     </w:pPr>
@@ -3245,9 +3191,9 @@
       <w:szCs w:val="22"/>
     </w:rPr>
   </w:style>
-  <w:style w:type="paragraph" w:customStyle="1" w:styleId="DE76DF7444E84A889BAB0FC407FEB17D">
-    <w:name w:val="DE76DF7444E84A889BAB0FC407FEB17D"/>
-    <w:rsid w:val="00A95E4E"/>
+  <w:style w:type="paragraph" w:customStyle="1" w:styleId="A9BF5630463F462EA219286500D9DAF71">
+    <w:name w:val="A9BF5630463F462EA219286500D9DAF71"/>
+    <w:rsid w:val="00792427"/>
     <w:pPr>
       <w:spacing w:after="120" w:line="360" w:lineRule="auto"/>
     </w:pPr>
@@ -3257,9 +3203,9 @@
       <w:szCs w:val="22"/>
     </w:rPr>
   </w:style>
-  <w:style w:type="paragraph" w:customStyle="1" w:styleId="70F6A5F631E447078C89BDF3F5458EB51">
-    <w:name w:val="70F6A5F631E447078C89BDF3F5458EB51"/>
-    <w:rsid w:val="00A95E4E"/>
+  <w:style w:type="paragraph" w:customStyle="1" w:styleId="A2B922179FB34629AFC41165ECAD196E">
+    <w:name w:val="A2B922179FB34629AFC41165ECAD196E"/>
+    <w:rsid w:val="00792427"/>
     <w:pPr>
       <w:spacing w:after="120" w:line="360" w:lineRule="auto"/>
     </w:pPr>
@@ -3269,9 +3215,9 @@
       <w:szCs w:val="22"/>
     </w:rPr>
   </w:style>
-  <w:style w:type="paragraph" w:customStyle="1" w:styleId="F1BE0A69C7ED4A6C98CD4C369DD84B241">
-    <w:name w:val="F1BE0A69C7ED4A6C98CD4C369DD84B241"/>
-    <w:rsid w:val="00A95E4E"/>
+  <w:style w:type="paragraph" w:customStyle="1" w:styleId="994D7BA1863F4C78B7EE7927865E1143">
+    <w:name w:val="994D7BA1863F4C78B7EE7927865E1143"/>
+    <w:rsid w:val="00792427"/>
     <w:pPr>
       <w:spacing w:after="120" w:line="360" w:lineRule="auto"/>
     </w:pPr>
@@ -3281,9 +3227,9 @@
       <w:szCs w:val="22"/>
     </w:rPr>
   </w:style>
-  <w:style w:type="paragraph" w:customStyle="1" w:styleId="5513D8C4184E4EF086A4063A9D9C37641">
-    <w:name w:val="5513D8C4184E4EF086A4063A9D9C37641"/>
-    <w:rsid w:val="00A95E4E"/>
+  <w:style w:type="paragraph" w:customStyle="1" w:styleId="86A13E55BF6A4AC2828AE3B1758ACEFB1">
+    <w:name w:val="86A13E55BF6A4AC2828AE3B1758ACEFB1"/>
+    <w:rsid w:val="00792427"/>
     <w:pPr>
       <w:spacing w:after="120" w:line="360" w:lineRule="auto"/>
     </w:pPr>
@@ -3293,9 +3239,9 @@
       <w:szCs w:val="22"/>
     </w:rPr>
   </w:style>
-  <w:style w:type="paragraph" w:customStyle="1" w:styleId="A0FE7D89F06E4EF494ECD88DA77692051">
-    <w:name w:val="A0FE7D89F06E4EF494ECD88DA77692051"/>
-    <w:rsid w:val="00A95E4E"/>
+  <w:style w:type="paragraph" w:customStyle="1" w:styleId="E7101914D11D4BDC9DB6DE368C98B9691">
+    <w:name w:val="E7101914D11D4BDC9DB6DE368C98B9691"/>
+    <w:rsid w:val="00792427"/>
     <w:pPr>
       <w:spacing w:after="120" w:line="360" w:lineRule="auto"/>
     </w:pPr>
@@ -3305,9 +3251,9 @@
       <w:szCs w:val="22"/>
     </w:rPr>
   </w:style>
-  <w:style w:type="paragraph" w:customStyle="1" w:styleId="BC7BB2D302D045F180CC2A1E9F4D5CF91">
-    <w:name w:val="BC7BB2D302D045F180CC2A1E9F4D5CF91"/>
-    <w:rsid w:val="00A95E4E"/>
+  <w:style w:type="paragraph" w:customStyle="1" w:styleId="5B6DF39B40544798AB737C73C03514381">
+    <w:name w:val="5B6DF39B40544798AB737C73C03514381"/>
+    <w:rsid w:val="00792427"/>
     <w:pPr>
       <w:spacing w:after="120" w:line="360" w:lineRule="auto"/>
     </w:pPr>
@@ -3317,9 +3263,9 @@
       <w:szCs w:val="22"/>
     </w:rPr>
   </w:style>
-  <w:style w:type="paragraph" w:customStyle="1" w:styleId="24CAD0A8F14F4B3E9AD64C05D0E31F761">
-    <w:name w:val="24CAD0A8F14F4B3E9AD64C05D0E31F761"/>
-    <w:rsid w:val="00A95E4E"/>
+  <w:style w:type="paragraph" w:customStyle="1" w:styleId="4A3EB98DE1EB4BA6A2F51900886A6B331">
+    <w:name w:val="4A3EB98DE1EB4BA6A2F51900886A6B331"/>
+    <w:rsid w:val="00792427"/>
     <w:pPr>
       <w:spacing w:after="120" w:line="360" w:lineRule="auto"/>
     </w:pPr>
@@ -3329,9 +3275,9 @@
       <w:szCs w:val="22"/>
     </w:rPr>
   </w:style>
-  <w:style w:type="paragraph" w:customStyle="1" w:styleId="4D0E9499D7914A01864FB8A78CA91B1D1">
-    <w:name w:val="4D0E9499D7914A01864FB8A78CA91B1D1"/>
-    <w:rsid w:val="00A95E4E"/>
+  <w:style w:type="paragraph" w:customStyle="1" w:styleId="1F3F82669AE341D18ABB707730240BB41">
+    <w:name w:val="1F3F82669AE341D18ABB707730240BB41"/>
+    <w:rsid w:val="00792427"/>
     <w:pPr>
       <w:spacing w:after="120" w:line="360" w:lineRule="auto"/>
     </w:pPr>

</xml_diff>

<commit_message>
day 20+21: fix 1 so loi tiem an cua cac giao dien khac, bo sung truong thong tin nhan vien, cu dan
</commit_message>
<xml_diff>
--- a/assets/templates/hd_mua_ch.docx
+++ b/assets/templates/hd_mua_ch.docx
@@ -143,33 +143,129 @@
         <w:rPr>
           <w:color w:val="000000" w:themeColor="text1"/>
         </w:rPr>
-        <w:t>Căn cứ Bộ luật Dân sự số 91/2015/QH13 do Quốc hội nước Cộng hòa xã hội chủ nghĩa Việt Nam ban hành có hiệu lực năm 2015;</w:t>
-      </w:r>
-    </w:p>
-    <w:p>
-      <w:pPr>
-        <w:rPr>
-          <w:color w:val="000000" w:themeColor="text1"/>
-        </w:rPr>
-      </w:pPr>
-      <w:r>
-        <w:rPr>
-          <w:color w:val="000000" w:themeColor="text1"/>
-        </w:rPr>
-        <w:t>Căn cứ Luật Kinh doanh bất động sản số 66/2014/QH13 do Quốc hội nước Cộng hòa xã hội chủ nghĩa Việt Nam ban hành có hiệu lực năm 2015;</w:t>
-      </w:r>
-    </w:p>
-    <w:p>
-      <w:pPr>
-        <w:rPr>
-          <w:color w:val="000000" w:themeColor="text1"/>
-        </w:rPr>
-      </w:pPr>
-      <w:r>
-        <w:rPr>
-          <w:color w:val="000000" w:themeColor="text1"/>
-        </w:rPr>
-        <w:t>Căn cứ Luật Nhà ở số 65/2014/QH13 do Quốc hội nước Cộng hòa xã hội chủ nghĩa Việt Nam ban hành có hiệu lực năm 2015; </w:t>
+        <w:t xml:space="preserve">Căn cứ Bộ luật Dân sự số </w:t>
+      </w:r>
+      <w:r>
+        <w:rPr>
+          <w:color w:val="000000" w:themeColor="text1"/>
+        </w:rPr>
+        <w:t>…..</w:t>
+      </w:r>
+      <w:r>
+        <w:rPr>
+          <w:color w:val="000000" w:themeColor="text1"/>
+        </w:rPr>
+        <w:t>/</w:t>
+      </w:r>
+      <w:r>
+        <w:rPr>
+          <w:color w:val="000000" w:themeColor="text1"/>
+        </w:rPr>
+        <w:t>………..</w:t>
+      </w:r>
+      <w:r>
+        <w:rPr>
+          <w:color w:val="000000" w:themeColor="text1"/>
+        </w:rPr>
+        <w:t>/</w:t>
+      </w:r>
+      <w:r>
+        <w:rPr>
+          <w:color w:val="000000" w:themeColor="text1"/>
+        </w:rPr>
+        <w:t xml:space="preserve">………… </w:t>
+      </w:r>
+      <w:r>
+        <w:rPr>
+          <w:color w:val="000000" w:themeColor="text1"/>
+        </w:rPr>
+        <w:t xml:space="preserve">do Quốc hội nước Cộng hòa xã hội chủ nghĩa Việt Nam ban hành có hiệu lực năm </w:t>
+      </w:r>
+      <w:r>
+        <w:rPr>
+          <w:color w:val="000000" w:themeColor="text1"/>
+        </w:rPr>
+        <w:t>………</w:t>
+      </w:r>
+      <w:r>
+        <w:rPr>
+          <w:color w:val="000000" w:themeColor="text1"/>
+        </w:rPr>
+        <w:t>;</w:t>
+      </w:r>
+    </w:p>
+    <w:p>
+      <w:pPr>
+        <w:rPr>
+          <w:color w:val="000000" w:themeColor="text1"/>
+        </w:rPr>
+      </w:pPr>
+      <w:r>
+        <w:rPr>
+          <w:color w:val="000000" w:themeColor="text1"/>
+        </w:rPr>
+        <w:t xml:space="preserve">Căn cứ Luật Kinh doanh bất động sản số </w:t>
+      </w:r>
+      <w:r>
+        <w:rPr>
+          <w:color w:val="000000" w:themeColor="text1"/>
+        </w:rPr>
+        <w:t xml:space="preserve">…../………../………… </w:t>
+      </w:r>
+      <w:r>
+        <w:rPr>
+          <w:color w:val="000000" w:themeColor="text1"/>
+        </w:rPr>
+        <w:t xml:space="preserve">do Quốc hội nước Cộng hòa xã hội chủ nghĩa Việt Nam ban hành có hiệu lực năm </w:t>
+      </w:r>
+      <w:r>
+        <w:rPr>
+          <w:color w:val="000000" w:themeColor="text1"/>
+        </w:rPr>
+        <w:t>………;</w:t>
+      </w:r>
+      <w:r>
+        <w:rPr>
+          <w:color w:val="000000" w:themeColor="text1"/>
+        </w:rPr>
+        <w:t>;</w:t>
+      </w:r>
+    </w:p>
+    <w:p>
+      <w:pPr>
+        <w:rPr>
+          <w:color w:val="000000" w:themeColor="text1"/>
+        </w:rPr>
+      </w:pPr>
+      <w:r>
+        <w:rPr>
+          <w:color w:val="000000" w:themeColor="text1"/>
+        </w:rPr>
+        <w:t xml:space="preserve">Căn cứ Luật Nhà ở số </w:t>
+      </w:r>
+      <w:r>
+        <w:rPr>
+          <w:color w:val="000000" w:themeColor="text1"/>
+        </w:rPr>
+        <w:t xml:space="preserve">…../………../………… </w:t>
+      </w:r>
+      <w:r>
+        <w:rPr>
+          <w:color w:val="000000" w:themeColor="text1"/>
+        </w:rPr>
+        <w:t xml:space="preserve">do Quốc hội nước Cộng hòa xã hội chủ nghĩa Việt Nam ban hành có hiệu lực năm </w:t>
+      </w:r>
+      <w:r>
+        <w:rPr>
+          <w:color w:val="000000" w:themeColor="text1"/>
+        </w:rPr>
+        <w:t>………..</w:t>
+      </w:r>
+      <w:r>
+        <w:rPr>
+          <w:color w:val="000000" w:themeColor="text1"/>
+        </w:rPr>
+        <w:t>; </w:t>
       </w:r>
     </w:p>
     <w:p>
@@ -328,8 +424,18 @@
         <w:rPr>
           <w:color w:val="000000" w:themeColor="text1"/>
         </w:rPr>
-        <w:t>- Mã số thuế: ...........................................................................................…………</w:t>
-      </w:r>
+        <w:t xml:space="preserve">- Mã số thuế: </w:t>
+      </w:r>
+      <w:hyperlink r:id="rId4" w:tooltip="Mã số thuế 5200946273" w:history="1">
+        <w:r>
+          <w:rPr>
+            <w:rStyle w:val="Hyperlink"/>
+            <w:color w:val="000000" w:themeColor="text1"/>
+            <w:u w:val="none"/>
+          </w:rPr>
+          <w:t>5200946273</w:t>
+        </w:r>
+      </w:hyperlink>
     </w:p>
     <w:p>
       <w:pPr>
@@ -393,7 +499,7 @@
         <w:rPr>
           <w:color w:val="000000" w:themeColor="text1"/>
         </w:rPr>
-        <w:t>- Danh sách các cá nhân (nếu có):</w:t>
+        <w:t>- Danh sách các cá nhân:</w:t>
       </w:r>
     </w:p>
     <w:sdt>
@@ -444,7 +550,19 @@
             <w:rPr>
               <w:color w:val="000000" w:themeColor="text1"/>
             </w:rPr>
-            <w:t xml:space="preserve">- </w:t>
+            <w:t xml:space="preserve"> </w:t>
+          </w:r>
+          <w:r>
+            <w:rPr>
+              <w:color w:val="000000" w:themeColor="text1"/>
+            </w:rPr>
+            <w:t>-</w:t>
+          </w:r>
+          <w:r>
+            <w:rPr>
+              <w:color w:val="000000" w:themeColor="text1"/>
+            </w:rPr>
+            <w:t xml:space="preserve"> </w:t>
           </w:r>
           <w:sdt>
             <w:sdtPr>
@@ -455,7 +573,7 @@
               <w:tag w:val="text"/>
               <w:id w:val="-749117412"/>
               <w:placeholder>
-                <w:docPart w:val="A2B922179FB34629AFC41165ECAD196E"/>
+                <w:docPart w:val="A5527FA788424400BD41871CCAC088A7"/>
               </w:placeholder>
               <w:showingPlcHdr/>
               <w:text/>
@@ -474,7 +592,103 @@
             <w:rPr>
               <w:color w:val="000000" w:themeColor="text1"/>
             </w:rPr>
-            <w:t>-</w:t>
+            <w:t xml:space="preserve">- </w:t>
+          </w:r>
+          <w:sdt>
+            <w:sdtPr>
+              <w:rPr>
+                <w:color w:val="000000" w:themeColor="text1"/>
+              </w:rPr>
+              <w:alias w:val="resident_gender"/>
+              <w:tag w:val="text"/>
+              <w:id w:val="1865395130"/>
+              <w:placeholder>
+                <w:docPart w:val="F60E9C54218A4CC6827129ACA540F8E2"/>
+              </w:placeholder>
+              <w:showingPlcHdr/>
+              <w:text/>
+            </w:sdtPr>
+            <w:sdtContent>
+              <w:r>
+                <w:rPr>
+                  <w:rStyle w:val="PlaceholderText"/>
+                  <w:color w:val="000000" w:themeColor="text1"/>
+                </w:rPr>
+                <w:t>Click or tap here to enter text.</w:t>
+              </w:r>
+            </w:sdtContent>
+          </w:sdt>
+          <w:r>
+            <w:rPr>
+              <w:color w:val="000000" w:themeColor="text1"/>
+            </w:rPr>
+            <w:t xml:space="preserve"> </w:t>
+          </w:r>
+          <w:r>
+            <w:rPr>
+              <w:color w:val="000000" w:themeColor="text1"/>
+            </w:rPr>
+            <w:t xml:space="preserve">- </w:t>
+          </w:r>
+          <w:sdt>
+            <w:sdtPr>
+              <w:rPr>
+                <w:color w:val="000000" w:themeColor="text1"/>
+              </w:rPr>
+              <w:alias w:val="resident_birthdate"/>
+              <w:tag w:val="text"/>
+              <w:id w:val="512656867"/>
+              <w:placeholder>
+                <w:docPart w:val="D608E601A21D41AC84294865FED1754B"/>
+              </w:placeholder>
+              <w:showingPlcHdr/>
+              <w:text/>
+            </w:sdtPr>
+            <w:sdtContent>
+              <w:r>
+                <w:rPr>
+                  <w:rStyle w:val="PlaceholderText"/>
+                  <w:color w:val="000000" w:themeColor="text1"/>
+                </w:rPr>
+                <w:t>Click or tap here to enter text.</w:t>
+              </w:r>
+            </w:sdtContent>
+          </w:sdt>
+          <w:r>
+            <w:rPr>
+              <w:color w:val="000000" w:themeColor="text1"/>
+            </w:rPr>
+            <w:t xml:space="preserve"> - </w:t>
+          </w:r>
+          <w:sdt>
+            <w:sdtPr>
+              <w:rPr>
+                <w:color w:val="000000" w:themeColor="text1"/>
+              </w:rPr>
+              <w:alias w:val="resident_address"/>
+              <w:tag w:val="text"/>
+              <w:id w:val="-695696563"/>
+              <w:placeholder>
+                <w:docPart w:val="58039A3A86EA4DEB9C053B4706069F2B"/>
+              </w:placeholder>
+              <w:showingPlcHdr/>
+              <w:text/>
+            </w:sdtPr>
+            <w:sdtContent>
+              <w:r>
+                <w:rPr>
+                  <w:rStyle w:val="PlaceholderText"/>
+                  <w:color w:val="000000" w:themeColor="text1"/>
+                </w:rPr>
+                <w:t>Click or tap here to enter text.</w:t>
+              </w:r>
+            </w:sdtContent>
+          </w:sdt>
+          <w:r>
+            <w:rPr>
+              <w:color w:val="000000" w:themeColor="text1"/>
+            </w:rPr>
+            <w:t xml:space="preserve"> -</w:t>
           </w:r>
           <w:sdt>
             <w:sdtPr>
@@ -543,57 +757,18 @@
         <w:rPr>
           <w:color w:val="000000" w:themeColor="text1"/>
         </w:rPr>
-        <w:t>1.1. Bên A cho bên B thuê tại: ................................................................................. </w:t>
-      </w:r>
-    </w:p>
-    <w:p>
-      <w:pPr>
-        <w:rPr>
-          <w:color w:val="000000" w:themeColor="text1"/>
-        </w:rPr>
-      </w:pPr>
-      <w:r>
-        <w:rPr>
-          <w:color w:val="000000" w:themeColor="text1"/>
-        </w:rPr>
-        <w:t>để sử dụng vào mục đích: ....................................................................................... </w:t>
-      </w:r>
-    </w:p>
-    <w:p>
-      <w:pPr>
-        <w:rPr>
-          <w:color w:val="000000" w:themeColor="text1"/>
-        </w:rPr>
-      </w:pPr>
-      <w:r>
-        <w:rPr>
-          <w:color w:val="000000" w:themeColor="text1"/>
-        </w:rPr>
-        <w:t>1.2. Quyền sở hữu của bên A đối với căn hộ cụ thể như sau:</w:t>
-      </w:r>
-    </w:p>
-    <w:p>
-      <w:pPr>
-        <w:rPr>
-          <w:color w:val="000000" w:themeColor="text1"/>
-        </w:rPr>
-      </w:pPr>
-      <w:r>
-        <w:rPr>
-          <w:color w:val="000000" w:themeColor="text1"/>
-        </w:rPr>
-        <w:t xml:space="preserve">a) Địa chỉ tòa nhà căn hộ: </w:t>
+        <w:t xml:space="preserve">1.1. Bên A cho bên B thuê để sử dụng vào mục đích: </w:t>
       </w:r>
       <w:sdt>
         <w:sdtPr>
           <w:rPr>
             <w:color w:val="000000" w:themeColor="text1"/>
           </w:rPr>
-          <w:alias w:val="building"/>
+          <w:alias w:val="purpose"/>
           <w:tag w:val="text"/>
-          <w:id w:val="-1514294962"/>
+          <w:id w:val="807980118"/>
           <w:placeholder>
-            <w:docPart w:val="86A13E55BF6A4AC2828AE3B1758ACEFB"/>
+            <w:docPart w:val="FC995E17A25344DD89C1B74E3BA63695"/>
           </w:placeholder>
           <w:showingPlcHdr/>
           <w:text/>
@@ -608,6 +783,32 @@
           </w:r>
         </w:sdtContent>
       </w:sdt>
+    </w:p>
+    <w:p>
+      <w:pPr>
+        <w:rPr>
+          <w:color w:val="000000" w:themeColor="text1"/>
+        </w:rPr>
+      </w:pPr>
+      <w:r>
+        <w:rPr>
+          <w:color w:val="000000" w:themeColor="text1"/>
+        </w:rPr>
+        <w:t>1.2. Quyền sở hữu của bên A đối với căn hộ cụ thể như sau:</w:t>
+      </w:r>
+    </w:p>
+    <w:p>
+      <w:pPr>
+        <w:rPr>
+          <w:color w:val="000000" w:themeColor="text1"/>
+        </w:rPr>
+      </w:pPr>
+      <w:r>
+        <w:rPr>
+          <w:color w:val="000000" w:themeColor="text1"/>
+        </w:rPr>
+        <w:t xml:space="preserve">a) Địa chỉ tòa nhà căn hộ: </w:t>
+      </w:r>
     </w:p>
     <w:p>
       <w:pPr>
@@ -645,6 +846,36 @@
           </w:r>
         </w:sdtContent>
       </w:sdt>
+      <w:r>
+        <w:rPr>
+          <w:color w:val="000000" w:themeColor="text1"/>
+        </w:rPr>
+        <w:t xml:space="preserve">. Tầng số: </w:t>
+      </w:r>
+      <w:sdt>
+        <w:sdtPr>
+          <w:rPr>
+            <w:color w:val="000000" w:themeColor="text1"/>
+          </w:rPr>
+          <w:alias w:val="building"/>
+          <w:tag w:val="text"/>
+          <w:id w:val="-133718477"/>
+          <w:placeholder>
+            <w:docPart w:val="F574CC891E3447A7AB7DDA00E3B4A1A4"/>
+          </w:placeholder>
+          <w:showingPlcHdr/>
+          <w:text/>
+        </w:sdtPr>
+        <w:sdtContent>
+          <w:r>
+            <w:rPr>
+              <w:rStyle w:val="PlaceholderText"/>
+              <w:color w:val="000000" w:themeColor="text1"/>
+            </w:rPr>
+            <w:t>Click or tap here to enter text.</w:t>
+          </w:r>
+        </w:sdtContent>
+      </w:sdt>
     </w:p>
     <w:p>
       <w:pPr>
@@ -705,8 +936,32 @@
         <w:rPr>
           <w:color w:val="000000" w:themeColor="text1"/>
         </w:rPr>
-        <w:t>e) Trang thiết bị gắn liền với căn hộ: ....................................................................... </w:t>
-      </w:r>
+        <w:t xml:space="preserve">e) Trang thiết bị gắn liền với căn hộ: </w:t>
+      </w:r>
+      <w:sdt>
+        <w:sdtPr>
+          <w:rPr>
+            <w:color w:val="000000" w:themeColor="text1"/>
+          </w:rPr>
+          <w:alias w:val="devices"/>
+          <w:tag w:val="text"/>
+          <w:id w:val="-1420638181"/>
+          <w:placeholder>
+            <w:docPart w:val="DCAD2F39CA904DCD868D2D248E804FAD"/>
+          </w:placeholder>
+          <w:showingPlcHdr/>
+          <w:text/>
+        </w:sdtPr>
+        <w:sdtContent>
+          <w:r>
+            <w:rPr>
+              <w:rStyle w:val="PlaceholderText"/>
+              <w:color w:val="000000" w:themeColor="text1"/>
+            </w:rPr>
+            <w:t>Click or tap here to enter text.</w:t>
+          </w:r>
+        </w:sdtContent>
+      </w:sdt>
     </w:p>
     <w:p>
       <w:pPr>
@@ -731,6 +986,7 @@
         <w:rPr>
           <w:color w:val="000000" w:themeColor="text1"/>
         </w:rPr>
+        <w:lastRenderedPageBreak/>
         <w:t>g)</w:t>
       </w:r>
       <w:r>
@@ -747,8 +1003,32 @@
         <w:rPr>
           <w:color w:val="000000" w:themeColor="text1"/>
         </w:rPr>
-        <w:t> ....................................... </w:t>
-      </w:r>
+        <w:t> </w:t>
+      </w:r>
+      <w:sdt>
+        <w:sdtPr>
+          <w:rPr>
+            <w:color w:val="000000" w:themeColor="text1"/>
+          </w:rPr>
+          <w:alias w:val="limit"/>
+          <w:tag w:val="text"/>
+          <w:id w:val="962926480"/>
+          <w:placeholder>
+            <w:docPart w:val="285AE5B694214FC69829A8D4505B40D8"/>
+          </w:placeholder>
+          <w:showingPlcHdr/>
+          <w:text/>
+        </w:sdtPr>
+        <w:sdtContent>
+          <w:r>
+            <w:rPr>
+              <w:rStyle w:val="PlaceholderText"/>
+              <w:color w:val="000000" w:themeColor="text1"/>
+            </w:rPr>
+            <w:t>Click or tap here to enter text.</w:t>
+          </w:r>
+        </w:sdtContent>
+      </w:sdt>
     </w:p>
     <w:bookmarkEnd w:id="1"/>
     <w:p>
@@ -797,7 +1077,6 @@
           <w:color w:val="000000" w:themeColor="text1"/>
           <w:szCs w:val="28"/>
         </w:rPr>
-        <w:lastRenderedPageBreak/>
         <w:t xml:space="preserve">2.1. Giá bán căn hộ là  </w:t>
       </w:r>
       <w:sdt>
@@ -866,19 +1145,95 @@
       <w:pPr>
         <w:rPr>
           <w:rFonts w:cs="Times New Roman"/>
+          <w:color w:val="000000" w:themeColor="text1"/>
+          <w:szCs w:val="28"/>
+        </w:rPr>
+      </w:pPr>
+      <w:r>
+        <w:rPr>
+          <w:rFonts w:cs="Times New Roman"/>
+          <w:color w:val="000000" w:themeColor="text1"/>
+          <w:szCs w:val="28"/>
+        </w:rPr>
+        <w:t>2.2. Phương thức thanh toán: thanh toán bằng tiền Việt Nam thông qua hình thức (</w:t>
+      </w:r>
+      <w:r>
+        <w:rPr>
+          <w:rFonts w:cs="Times New Roman"/>
           <w:i/>
           <w:iCs/>
           <w:color w:val="000000" w:themeColor="text1"/>
           <w:szCs w:val="28"/>
         </w:rPr>
-      </w:pPr>
-      <w:r>
-        <w:rPr>
-          <w:rFonts w:cs="Times New Roman"/>
-          <w:color w:val="000000" w:themeColor="text1"/>
-          <w:szCs w:val="28"/>
-        </w:rPr>
-        <w:t>(</w:t>
+        <w:t>trả bằng tiền mặt hoặc chuyển khoản qua ngân hàng</w:t>
+      </w:r>
+      <w:r>
+        <w:rPr>
+          <w:rFonts w:cs="Times New Roman"/>
+          <w:color w:val="000000" w:themeColor="text1"/>
+          <w:szCs w:val="28"/>
+        </w:rPr>
+        <w:t xml:space="preserve">) </w:t>
+      </w:r>
+    </w:p>
+    <w:p>
+      <w:pPr>
+        <w:rPr>
+          <w:rFonts w:cs="Times New Roman"/>
+          <w:color w:val="000000" w:themeColor="text1"/>
+          <w:szCs w:val="28"/>
+        </w:rPr>
+      </w:pPr>
+      <w:r>
+        <w:rPr>
+          <w:rFonts w:cs="Times New Roman"/>
+          <w:color w:val="000000" w:themeColor="text1"/>
+          <w:szCs w:val="28"/>
+        </w:rPr>
+        <w:t xml:space="preserve">2.3. Thời hạn thanh toán: </w:t>
+      </w:r>
+      <w:sdt>
+        <w:sdtPr>
+          <w:rPr>
+            <w:rFonts w:cs="Times New Roman"/>
+            <w:color w:val="000000" w:themeColor="text1"/>
+            <w:szCs w:val="28"/>
+          </w:rPr>
+          <w:alias w:val="time_pay"/>
+          <w:tag w:val="text"/>
+          <w:id w:val="2030286614"/>
+          <w:placeholder>
+            <w:docPart w:val="88BE9ACDC932486EBB50CA6279B58D91"/>
+          </w:placeholder>
+          <w:showingPlcHdr/>
+          <w:text/>
+        </w:sdtPr>
+        <w:sdtContent>
+          <w:r>
+            <w:rPr>
+              <w:rStyle w:val="PlaceholderText"/>
+              <w:color w:val="000000" w:themeColor="text1"/>
+            </w:rPr>
+            <w:t>Click or tap here to enter text.</w:t>
+          </w:r>
+        </w:sdtContent>
+      </w:sdt>
+    </w:p>
+    <w:p>
+      <w:pPr>
+        <w:rPr>
+          <w:rFonts w:cs="Times New Roman"/>
+          <w:color w:val="000000" w:themeColor="text1"/>
+          <w:szCs w:val="28"/>
+        </w:rPr>
+      </w:pPr>
+      <w:r>
+        <w:rPr>
+          <w:rFonts w:cs="Times New Roman"/>
+          <w:color w:val="000000" w:themeColor="text1"/>
+          <w:szCs w:val="28"/>
+        </w:rPr>
+        <w:t xml:space="preserve"> (</w:t>
       </w:r>
       <w:r>
         <w:rPr>
@@ -888,121 +1243,6 @@
           <w:color w:val="000000" w:themeColor="text1"/>
           <w:szCs w:val="28"/>
         </w:rPr>
-        <w:t>Trường hợp bên bán chưa thanh toán đủ cho chủ đầu tư, thì phải quy định rõ giá bán đã bao gồm, chưa bao gồm gì)……………………………………………………….</w:t>
-      </w:r>
-    </w:p>
-    <w:p>
-      <w:pPr>
-        <w:rPr>
-          <w:rFonts w:cs="Times New Roman"/>
-          <w:color w:val="000000" w:themeColor="text1"/>
-          <w:szCs w:val="28"/>
-        </w:rPr>
-      </w:pPr>
-      <w:r>
-        <w:rPr>
-          <w:rFonts w:cs="Times New Roman"/>
-          <w:i/>
-          <w:iCs/>
-          <w:color w:val="000000" w:themeColor="text1"/>
-          <w:szCs w:val="28"/>
-        </w:rPr>
-        <w:t>……………………………………………………………………………………………………………………………………………………………………………………………………..</w:t>
-      </w:r>
-    </w:p>
-    <w:p>
-      <w:pPr>
-        <w:rPr>
-          <w:rFonts w:cs="Times New Roman"/>
-          <w:color w:val="000000" w:themeColor="text1"/>
-          <w:szCs w:val="28"/>
-        </w:rPr>
-      </w:pPr>
-      <w:r>
-        <w:rPr>
-          <w:rFonts w:cs="Times New Roman"/>
-          <w:color w:val="000000" w:themeColor="text1"/>
-          <w:szCs w:val="28"/>
-        </w:rPr>
-        <w:t>2.2. Phương thức thanh toán: thanh toán bằng tiền Việt Nam thông qua hình thức (</w:t>
-      </w:r>
-      <w:r>
-        <w:rPr>
-          <w:rFonts w:cs="Times New Roman"/>
-          <w:i/>
-          <w:iCs/>
-          <w:color w:val="000000" w:themeColor="text1"/>
-          <w:szCs w:val="28"/>
-        </w:rPr>
-        <w:t>trả bằng tiền mặt hoặc chuyển khoản qua ngân hàng</w:t>
-      </w:r>
-      <w:r>
-        <w:rPr>
-          <w:rFonts w:cs="Times New Roman"/>
-          <w:color w:val="000000" w:themeColor="text1"/>
-          <w:szCs w:val="28"/>
-        </w:rPr>
-        <w:t xml:space="preserve">) </w:t>
-      </w:r>
-    </w:p>
-    <w:p>
-      <w:pPr>
-        <w:rPr>
-          <w:rFonts w:cs="Times New Roman"/>
-          <w:color w:val="000000" w:themeColor="text1"/>
-          <w:szCs w:val="28"/>
-        </w:rPr>
-      </w:pPr>
-      <w:r>
-        <w:rPr>
-          <w:rFonts w:cs="Times New Roman"/>
-          <w:color w:val="000000" w:themeColor="text1"/>
-          <w:szCs w:val="28"/>
-        </w:rPr>
-        <w:t>2.3. Thời hạn thanh toán: …………………………………………………………...</w:t>
-      </w:r>
-    </w:p>
-    <w:p>
-      <w:pPr>
-        <w:rPr>
-          <w:rFonts w:cs="Times New Roman"/>
-          <w:color w:val="000000" w:themeColor="text1"/>
-          <w:szCs w:val="28"/>
-        </w:rPr>
-      </w:pPr>
-      <w:r>
-        <w:rPr>
-          <w:rFonts w:cs="Times New Roman"/>
-          <w:color w:val="000000" w:themeColor="text1"/>
-          <w:szCs w:val="28"/>
-        </w:rPr>
-        <w:t>……………………………………………………………………………………….……………………………………………………………………………………….</w:t>
-      </w:r>
-    </w:p>
-    <w:p>
-      <w:pPr>
-        <w:rPr>
-          <w:rFonts w:cs="Times New Roman"/>
-          <w:color w:val="000000" w:themeColor="text1"/>
-          <w:szCs w:val="28"/>
-        </w:rPr>
-      </w:pPr>
-      <w:r>
-        <w:rPr>
-          <w:rFonts w:cs="Times New Roman"/>
-          <w:color w:val="000000" w:themeColor="text1"/>
-          <w:szCs w:val="28"/>
-        </w:rPr>
-        <w:t xml:space="preserve"> (</w:t>
-      </w:r>
-      <w:r>
-        <w:rPr>
-          <w:rFonts w:cs="Times New Roman"/>
-          <w:i/>
-          <w:iCs/>
-          <w:color w:val="000000" w:themeColor="text1"/>
-          <w:szCs w:val="28"/>
-        </w:rPr>
         <w:t>Quy định rõ việc thanh toán được thực hiện thành mấy đợt, mỗi đợt thanh toán với số tiền là bao nhiêu và ngày của từng đợt thanh toán</w:t>
       </w:r>
       <w:r>
@@ -1013,6 +1253,40 @@
         </w:rPr>
         <w:t>)</w:t>
       </w:r>
+      <w:r>
+        <w:rPr>
+          <w:rFonts w:cs="Times New Roman"/>
+          <w:color w:val="000000" w:themeColor="text1"/>
+          <w:szCs w:val="28"/>
+        </w:rPr>
+        <w:t xml:space="preserve"> </w:t>
+      </w:r>
+      <w:sdt>
+        <w:sdtPr>
+          <w:rPr>
+            <w:rFonts w:cs="Times New Roman"/>
+            <w:color w:val="000000" w:themeColor="text1"/>
+            <w:szCs w:val="28"/>
+          </w:rPr>
+          <w:alias w:val="time_pay_attention"/>
+          <w:tag w:val="text"/>
+          <w:id w:val="-1881626075"/>
+          <w:placeholder>
+            <w:docPart w:val="BBC4719731604384ACDF68D894BF47AC"/>
+          </w:placeholder>
+          <w:showingPlcHdr/>
+          <w:text/>
+        </w:sdtPr>
+        <w:sdtContent>
+          <w:r>
+            <w:rPr>
+              <w:rStyle w:val="PlaceholderText"/>
+              <w:color w:val="000000" w:themeColor="text1"/>
+            </w:rPr>
+            <w:t>Click or tap here to enter text.</w:t>
+          </w:r>
+        </w:sdtContent>
+      </w:sdt>
     </w:p>
     <w:p>
       <w:pPr>
@@ -1049,8 +1323,42 @@
           <w:color w:val="000000" w:themeColor="text1"/>
           <w:szCs w:val="28"/>
         </w:rPr>
-        <w:t>3.1. Bên A có nghĩa vụ giao căn hộ nêu tại Điều 1 của Hợp đồng này cùng toàn bộ bản chính giấy tờ pháp lý của Căn hộ cho Bên B vào ngày ……………………….</w:t>
-      </w:r>
+        <w:t>3.1. Bên A có nghĩa vụ giao căn hộ nêu tại Điều 1 của Hợp đồng này cùng toàn bộ bản chính giấy tờ pháp lý của Căn hộ cho Bên B vào ngày</w:t>
+      </w:r>
+      <w:r>
+        <w:rPr>
+          <w:rFonts w:cs="Times New Roman"/>
+          <w:color w:val="000000" w:themeColor="text1"/>
+          <w:szCs w:val="28"/>
+        </w:rPr>
+        <w:t xml:space="preserve"> </w:t>
+      </w:r>
+      <w:sdt>
+        <w:sdtPr>
+          <w:rPr>
+            <w:rFonts w:cs="Times New Roman"/>
+            <w:color w:val="000000" w:themeColor="text1"/>
+            <w:szCs w:val="28"/>
+          </w:rPr>
+          <w:alias w:val="start_date"/>
+          <w:tag w:val="text"/>
+          <w:id w:val="750862487"/>
+          <w:placeholder>
+            <w:docPart w:val="4A967ADEA8C244D9A5469383FEEF7334"/>
+          </w:placeholder>
+          <w:showingPlcHdr/>
+          <w:text/>
+        </w:sdtPr>
+        <w:sdtContent>
+          <w:r>
+            <w:rPr>
+              <w:rStyle w:val="PlaceholderText"/>
+              <w:color w:val="000000" w:themeColor="text1"/>
+            </w:rPr>
+            <w:t>Click or tap here to enter text.</w:t>
+          </w:r>
+        </w:sdtContent>
+      </w:sdt>
     </w:p>
     <w:p>
       <w:pPr>
@@ -1317,6 +1625,13 @@
         </w:rPr>
         <w:t>Hợp đồng này được lập thành 3 bản và có giá trị như nhau. Mỗi bên giữ 1 bản, 1 bản lưu tại cơ quan công chứng hoặc chứng thực.</w:t>
       </w:r>
+    </w:p>
+    <w:p>
+      <w:pPr>
+        <w:rPr>
+          <w:color w:val="000000" w:themeColor="text1"/>
+        </w:rPr>
+      </w:pPr>
     </w:p>
     <w:p>
       <w:pPr>
@@ -2305,6 +2620,17 @@
       <w:color w:val="666666"/>
     </w:rPr>
   </w:style>
+  <w:style w:type="character" w:styleId="Hyperlink">
+    <w:name w:val="Hyperlink"/>
+    <w:basedOn w:val="DefaultParagraphFont"/>
+    <w:uiPriority w:val="99"/>
+    <w:unhideWhenUsed/>
+    <w:rsid w:val="00BC10C5"/>
+    <w:rPr>
+      <w:color w:val="0563C1" w:themeColor="hyperlink"/>
+      <w:u w:val="single"/>
+    </w:rPr>
+  </w:style>
 </w:styles>
 </file>
 
@@ -2329,7 +2655,7 @@
       <w:docPartBody>
         <w:p>
           <w:pPr>
-            <w:pStyle w:val="853CF763377A45ACA4B289B8E4CE1FEC3"/>
+            <w:pStyle w:val="853CF763377A45ACA4B289B8E4CE1FEC1"/>
           </w:pPr>
           <w:r>
             <w:rPr>
@@ -2361,36 +2687,6 @@
           <w:r>
             <w:rPr>
               <w:rStyle w:val="PlaceholderText"/>
-            </w:rPr>
-            <w:t>Click or tap here to enter text.</w:t>
-          </w:r>
-        </w:p>
-      </w:docPartBody>
-    </w:docPart>
-    <w:docPart>
-      <w:docPartPr>
-        <w:name w:val="A2B922179FB34629AFC41165ECAD196E"/>
-        <w:category>
-          <w:name w:val="General"/>
-          <w:gallery w:val="placeholder"/>
-        </w:category>
-        <w:types>
-          <w:type w:val="bbPlcHdr"/>
-        </w:types>
-        <w:behaviors>
-          <w:behavior w:val="content"/>
-        </w:behaviors>
-        <w:guid w:val="{71ED6387-9872-41CA-AF00-0D8BD49EFF2D}"/>
-      </w:docPartPr>
-      <w:docPartBody>
-        <w:p>
-          <w:pPr>
-            <w:pStyle w:val="A2B922179FB34629AFC41165ECAD196E"/>
-          </w:pPr>
-          <w:r>
-            <w:rPr>
-              <w:rStyle w:val="PlaceholderText"/>
-              <w:color w:val="000000" w:themeColor="text1"/>
             </w:rPr>
             <w:t>Click or tap here to enter text.</w:t>
           </w:r>
@@ -2445,7 +2741,7 @@
       <w:docPartBody>
         <w:p>
           <w:pPr>
-            <w:pStyle w:val="8B35AED859F9414BAE695BDF0831BDBE3"/>
+            <w:pStyle w:val="8B35AED859F9414BAE695BDF0831BDBE1"/>
           </w:pPr>
           <w:r>
             <w:rPr>
@@ -2476,36 +2772,6 @@
         <w:p>
           <w:pPr>
             <w:pStyle w:val="A9BF5630463F462EA219286500D9DAF71"/>
-          </w:pPr>
-          <w:r>
-            <w:rPr>
-              <w:rStyle w:val="PlaceholderText"/>
-              <w:color w:val="000000" w:themeColor="text1"/>
-            </w:rPr>
-            <w:t>Click or tap here to enter text.</w:t>
-          </w:r>
-        </w:p>
-      </w:docPartBody>
-    </w:docPart>
-    <w:docPart>
-      <w:docPartPr>
-        <w:name w:val="86A13E55BF6A4AC2828AE3B1758ACEFB"/>
-        <w:category>
-          <w:name w:val="General"/>
-          <w:gallery w:val="placeholder"/>
-        </w:category>
-        <w:types>
-          <w:type w:val="bbPlcHdr"/>
-        </w:types>
-        <w:behaviors>
-          <w:behavior w:val="content"/>
-        </w:behaviors>
-        <w:guid w:val="{7F549FE3-7031-42A4-893A-55C60FED4075}"/>
-      </w:docPartPr>
-      <w:docPartBody>
-        <w:p>
-          <w:pPr>
-            <w:pStyle w:val="86A13E55BF6A4AC2828AE3B1758ACEFB1"/>
           </w:pPr>
           <w:r>
             <w:rPr>
@@ -2637,6 +2903,329 @@
         </w:p>
       </w:docPartBody>
     </w:docPart>
+    <w:docPart>
+      <w:docPartPr>
+        <w:name w:val="58039A3A86EA4DEB9C053B4706069F2B"/>
+        <w:category>
+          <w:name w:val="General"/>
+          <w:gallery w:val="placeholder"/>
+        </w:category>
+        <w:types>
+          <w:type w:val="bbPlcHdr"/>
+        </w:types>
+        <w:behaviors>
+          <w:behavior w:val="content"/>
+        </w:behaviors>
+        <w:guid w:val="{B638B614-4D88-4131-84D2-DC996472F8D3}"/>
+      </w:docPartPr>
+      <w:docPartBody>
+        <w:p>
+          <w:pPr>
+            <w:pStyle w:val="58039A3A86EA4DEB9C053B4706069F2B1"/>
+          </w:pPr>
+          <w:r>
+            <w:rPr>
+              <w:rStyle w:val="PlaceholderText"/>
+              <w:color w:val="000000" w:themeColor="text1"/>
+            </w:rPr>
+            <w:t>Click or tap here to enter text.</w:t>
+          </w:r>
+        </w:p>
+      </w:docPartBody>
+    </w:docPart>
+    <w:docPart>
+      <w:docPartPr>
+        <w:name w:val="FC995E17A25344DD89C1B74E3BA63695"/>
+        <w:category>
+          <w:name w:val="General"/>
+          <w:gallery w:val="placeholder"/>
+        </w:category>
+        <w:types>
+          <w:type w:val="bbPlcHdr"/>
+        </w:types>
+        <w:behaviors>
+          <w:behavior w:val="content"/>
+        </w:behaviors>
+        <w:guid w:val="{93C66BD3-B1FD-41C8-BAA9-8C76F6E6257D}"/>
+      </w:docPartPr>
+      <w:docPartBody>
+        <w:p>
+          <w:pPr>
+            <w:pStyle w:val="FC995E17A25344DD89C1B74E3BA63695"/>
+          </w:pPr>
+          <w:r>
+            <w:rPr>
+              <w:rStyle w:val="PlaceholderText"/>
+            </w:rPr>
+            <w:t>Click or tap here to enter text.</w:t>
+          </w:r>
+        </w:p>
+      </w:docPartBody>
+    </w:docPart>
+    <w:docPart>
+      <w:docPartPr>
+        <w:name w:val="F574CC891E3447A7AB7DDA00E3B4A1A4"/>
+        <w:category>
+          <w:name w:val="General"/>
+          <w:gallery w:val="placeholder"/>
+        </w:category>
+        <w:types>
+          <w:type w:val="bbPlcHdr"/>
+        </w:types>
+        <w:behaviors>
+          <w:behavior w:val="content"/>
+        </w:behaviors>
+        <w:guid w:val="{5A73AF05-3368-4322-B202-86D857B63A54}"/>
+      </w:docPartPr>
+      <w:docPartBody>
+        <w:p>
+          <w:pPr>
+            <w:pStyle w:val="F574CC891E3447A7AB7DDA00E3B4A1A4"/>
+          </w:pPr>
+          <w:r>
+            <w:rPr>
+              <w:rStyle w:val="PlaceholderText"/>
+            </w:rPr>
+            <w:t>Click or tap here to enter text.</w:t>
+          </w:r>
+        </w:p>
+      </w:docPartBody>
+    </w:docPart>
+    <w:docPart>
+      <w:docPartPr>
+        <w:name w:val="DCAD2F39CA904DCD868D2D248E804FAD"/>
+        <w:category>
+          <w:name w:val="General"/>
+          <w:gallery w:val="placeholder"/>
+        </w:category>
+        <w:types>
+          <w:type w:val="bbPlcHdr"/>
+        </w:types>
+        <w:behaviors>
+          <w:behavior w:val="content"/>
+        </w:behaviors>
+        <w:guid w:val="{30B02150-B940-4F2F-B1C3-00A6F1A2323C}"/>
+      </w:docPartPr>
+      <w:docPartBody>
+        <w:p>
+          <w:pPr>
+            <w:pStyle w:val="DCAD2F39CA904DCD868D2D248E804FAD"/>
+          </w:pPr>
+          <w:r>
+            <w:rPr>
+              <w:rStyle w:val="PlaceholderText"/>
+            </w:rPr>
+            <w:t>Click or tap here to enter text.</w:t>
+          </w:r>
+        </w:p>
+      </w:docPartBody>
+    </w:docPart>
+    <w:docPart>
+      <w:docPartPr>
+        <w:name w:val="285AE5B694214FC69829A8D4505B40D8"/>
+        <w:category>
+          <w:name w:val="General"/>
+          <w:gallery w:val="placeholder"/>
+        </w:category>
+        <w:types>
+          <w:type w:val="bbPlcHdr"/>
+        </w:types>
+        <w:behaviors>
+          <w:behavior w:val="content"/>
+        </w:behaviors>
+        <w:guid w:val="{B2DE29FE-C3D2-493D-BEA6-3372549B2DF6}"/>
+      </w:docPartPr>
+      <w:docPartBody>
+        <w:p>
+          <w:pPr>
+            <w:pStyle w:val="285AE5B694214FC69829A8D4505B40D8"/>
+          </w:pPr>
+          <w:r>
+            <w:rPr>
+              <w:rStyle w:val="PlaceholderText"/>
+            </w:rPr>
+            <w:t>Click or tap here to enter text.</w:t>
+          </w:r>
+        </w:p>
+      </w:docPartBody>
+    </w:docPart>
+    <w:docPart>
+      <w:docPartPr>
+        <w:name w:val="88BE9ACDC932486EBB50CA6279B58D91"/>
+        <w:category>
+          <w:name w:val="General"/>
+          <w:gallery w:val="placeholder"/>
+        </w:category>
+        <w:types>
+          <w:type w:val="bbPlcHdr"/>
+        </w:types>
+        <w:behaviors>
+          <w:behavior w:val="content"/>
+        </w:behaviors>
+        <w:guid w:val="{3F419D83-761E-495D-BD19-A7B836C9F7C1}"/>
+      </w:docPartPr>
+      <w:docPartBody>
+        <w:p>
+          <w:pPr>
+            <w:pStyle w:val="88BE9ACDC932486EBB50CA6279B58D91"/>
+          </w:pPr>
+          <w:r>
+            <w:rPr>
+              <w:rStyle w:val="PlaceholderText"/>
+            </w:rPr>
+            <w:t>Click or tap here to enter text.</w:t>
+          </w:r>
+        </w:p>
+      </w:docPartBody>
+    </w:docPart>
+    <w:docPart>
+      <w:docPartPr>
+        <w:name w:val="BBC4719731604384ACDF68D894BF47AC"/>
+        <w:category>
+          <w:name w:val="General"/>
+          <w:gallery w:val="placeholder"/>
+        </w:category>
+        <w:types>
+          <w:type w:val="bbPlcHdr"/>
+        </w:types>
+        <w:behaviors>
+          <w:behavior w:val="content"/>
+        </w:behaviors>
+        <w:guid w:val="{CA84EFE3-45F3-45FD-A0F3-982AE62B1043}"/>
+      </w:docPartPr>
+      <w:docPartBody>
+        <w:p>
+          <w:pPr>
+            <w:pStyle w:val="BBC4719731604384ACDF68D894BF47AC"/>
+          </w:pPr>
+          <w:r>
+            <w:rPr>
+              <w:rStyle w:val="PlaceholderText"/>
+            </w:rPr>
+            <w:t>Click or tap here to enter text.</w:t>
+          </w:r>
+        </w:p>
+      </w:docPartBody>
+    </w:docPart>
+    <w:docPart>
+      <w:docPartPr>
+        <w:name w:val="4A967ADEA8C244D9A5469383FEEF7334"/>
+        <w:category>
+          <w:name w:val="General"/>
+          <w:gallery w:val="placeholder"/>
+        </w:category>
+        <w:types>
+          <w:type w:val="bbPlcHdr"/>
+        </w:types>
+        <w:behaviors>
+          <w:behavior w:val="content"/>
+        </w:behaviors>
+        <w:guid w:val="{B48D8C11-1A1B-4973-99E8-D82ED8B0DE0A}"/>
+      </w:docPartPr>
+      <w:docPartBody>
+        <w:p>
+          <w:pPr>
+            <w:pStyle w:val="4A967ADEA8C244D9A5469383FEEF7334"/>
+          </w:pPr>
+          <w:r>
+            <w:rPr>
+              <w:rStyle w:val="PlaceholderText"/>
+            </w:rPr>
+            <w:t>Click or tap here to enter text.</w:t>
+          </w:r>
+        </w:p>
+      </w:docPartBody>
+    </w:docPart>
+    <w:docPart>
+      <w:docPartPr>
+        <w:name w:val="A5527FA788424400BD41871CCAC088A7"/>
+        <w:category>
+          <w:name w:val="General"/>
+          <w:gallery w:val="placeholder"/>
+        </w:category>
+        <w:types>
+          <w:type w:val="bbPlcHdr"/>
+        </w:types>
+        <w:behaviors>
+          <w:behavior w:val="content"/>
+        </w:behaviors>
+        <w:guid w:val="{772F1509-7DE5-45A3-B40A-EFBAFA9377A8}"/>
+      </w:docPartPr>
+      <w:docPartBody>
+        <w:p>
+          <w:pPr>
+            <w:pStyle w:val="A5527FA788424400BD41871CCAC088A7"/>
+          </w:pPr>
+          <w:r>
+            <w:rPr>
+              <w:rStyle w:val="PlaceholderText"/>
+              <w:color w:val="000000" w:themeColor="text1"/>
+            </w:rPr>
+            <w:t>Click or tap here to enter text.</w:t>
+          </w:r>
+        </w:p>
+      </w:docPartBody>
+    </w:docPart>
+    <w:docPart>
+      <w:docPartPr>
+        <w:name w:val="F60E9C54218A4CC6827129ACA540F8E2"/>
+        <w:category>
+          <w:name w:val="General"/>
+          <w:gallery w:val="placeholder"/>
+        </w:category>
+        <w:types>
+          <w:type w:val="bbPlcHdr"/>
+        </w:types>
+        <w:behaviors>
+          <w:behavior w:val="content"/>
+        </w:behaviors>
+        <w:guid w:val="{486D8F6A-E64E-4CEF-89D3-9CC2AE42E04E}"/>
+      </w:docPartPr>
+      <w:docPartBody>
+        <w:p>
+          <w:pPr>
+            <w:pStyle w:val="F60E9C54218A4CC6827129ACA540F8E2"/>
+          </w:pPr>
+          <w:r>
+            <w:rPr>
+              <w:rStyle w:val="PlaceholderText"/>
+              <w:color w:val="000000" w:themeColor="text1"/>
+            </w:rPr>
+            <w:t>Click or tap here to enter text.</w:t>
+          </w:r>
+        </w:p>
+      </w:docPartBody>
+    </w:docPart>
+    <w:docPart>
+      <w:docPartPr>
+        <w:name w:val="D608E601A21D41AC84294865FED1754B"/>
+        <w:category>
+          <w:name w:val="General"/>
+          <w:gallery w:val="placeholder"/>
+        </w:category>
+        <w:types>
+          <w:type w:val="bbPlcHdr"/>
+        </w:types>
+        <w:behaviors>
+          <w:behavior w:val="content"/>
+        </w:behaviors>
+        <w:guid w:val="{566745AE-ECBC-4FAA-9A3C-BCCAAB77F4D9}"/>
+      </w:docPartPr>
+      <w:docPartBody>
+        <w:p>
+          <w:pPr>
+            <w:pStyle w:val="D608E601A21D41AC84294865FED1754B"/>
+          </w:pPr>
+          <w:r>
+            <w:rPr>
+              <w:rStyle w:val="PlaceholderText"/>
+              <w:color w:val="000000" w:themeColor="text1"/>
+            </w:rPr>
+            <w:t>Click or tap here to enter text.</w:t>
+          </w:r>
+        </w:p>
+      </w:docPartBody>
+    </w:docPart>
   </w:docParts>
 </w:glossaryDocument>
 </file>
@@ -2689,14 +3278,19 @@
     <w:rsid w:val="002A1F0E"/>
     <w:rsid w:val="002D41B0"/>
     <w:rsid w:val="00317D31"/>
+    <w:rsid w:val="0032546B"/>
     <w:rsid w:val="00353907"/>
     <w:rsid w:val="003C235D"/>
     <w:rsid w:val="0045031D"/>
+    <w:rsid w:val="005863C3"/>
     <w:rsid w:val="005D27E9"/>
     <w:rsid w:val="005D4B72"/>
     <w:rsid w:val="00602C3A"/>
     <w:rsid w:val="00613085"/>
+    <w:rsid w:val="006B10F5"/>
+    <w:rsid w:val="006C2225"/>
     <w:rsid w:val="006E2690"/>
+    <w:rsid w:val="006F02F9"/>
     <w:rsid w:val="00761948"/>
     <w:rsid w:val="00766937"/>
     <w:rsid w:val="00792427"/>
@@ -2707,6 +3301,7 @@
     <w:rsid w:val="00D143CE"/>
     <w:rsid w:val="00E67A5A"/>
     <w:rsid w:val="00E80F6E"/>
+    <w:rsid w:val="00EC3010"/>
   </w:rsids>
   <m:mathPr>
     <m:mathFont m:val="Cambria Math"/>
@@ -3162,14 +3757,26 @@
     <w:basedOn w:val="DefaultParagraphFont"/>
     <w:uiPriority w:val="99"/>
     <w:semiHidden/>
-    <w:rsid w:val="00792427"/>
+    <w:rsid w:val="006B10F5"/>
     <w:rPr>
       <w:color w:val="666666"/>
     </w:rPr>
   </w:style>
-  <w:style w:type="paragraph" w:customStyle="1" w:styleId="8B35AED859F9414BAE695BDF0831BDBE3">
-    <w:name w:val="8B35AED859F9414BAE695BDF0831BDBE3"/>
-    <w:rsid w:val="00792427"/>
+  <w:style w:type="paragraph" w:customStyle="1" w:styleId="A5527FA788424400BD41871CCAC088A7">
+    <w:name w:val="A5527FA788424400BD41871CCAC088A7"/>
+    <w:rsid w:val="006B10F5"/>
+  </w:style>
+  <w:style w:type="paragraph" w:customStyle="1" w:styleId="F60E9C54218A4CC6827129ACA540F8E2">
+    <w:name w:val="F60E9C54218A4CC6827129ACA540F8E2"/>
+    <w:rsid w:val="006B10F5"/>
+  </w:style>
+  <w:style w:type="paragraph" w:customStyle="1" w:styleId="D608E601A21D41AC84294865FED1754B">
+    <w:name w:val="D608E601A21D41AC84294865FED1754B"/>
+    <w:rsid w:val="006B10F5"/>
+  </w:style>
+  <w:style w:type="paragraph" w:customStyle="1" w:styleId="8B35AED859F9414BAE695BDF0831BDBE1">
+    <w:name w:val="8B35AED859F9414BAE695BDF0831BDBE1"/>
+    <w:rsid w:val="006B10F5"/>
     <w:pPr>
       <w:spacing w:after="120" w:line="360" w:lineRule="auto"/>
     </w:pPr>
@@ -3179,9 +3786,9 @@
       <w:szCs w:val="22"/>
     </w:rPr>
   </w:style>
-  <w:style w:type="paragraph" w:customStyle="1" w:styleId="853CF763377A45ACA4B289B8E4CE1FEC3">
-    <w:name w:val="853CF763377A45ACA4B289B8E4CE1FEC3"/>
-    <w:rsid w:val="00792427"/>
+  <w:style w:type="paragraph" w:customStyle="1" w:styleId="853CF763377A45ACA4B289B8E4CE1FEC1">
+    <w:name w:val="853CF763377A45ACA4B289B8E4CE1FEC1"/>
+    <w:rsid w:val="006B10F5"/>
     <w:pPr>
       <w:spacing w:after="120" w:line="360" w:lineRule="auto"/>
     </w:pPr>
@@ -3193,7 +3800,7 @@
   </w:style>
   <w:style w:type="paragraph" w:customStyle="1" w:styleId="A9BF5630463F462EA219286500D9DAF71">
     <w:name w:val="A9BF5630463F462EA219286500D9DAF71"/>
-    <w:rsid w:val="00792427"/>
+    <w:rsid w:val="006B10F5"/>
     <w:pPr>
       <w:spacing w:after="120" w:line="360" w:lineRule="auto"/>
     </w:pPr>
@@ -3203,9 +3810,9 @@
       <w:szCs w:val="22"/>
     </w:rPr>
   </w:style>
-  <w:style w:type="paragraph" w:customStyle="1" w:styleId="A2B922179FB34629AFC41165ECAD196E">
-    <w:name w:val="A2B922179FB34629AFC41165ECAD196E"/>
-    <w:rsid w:val="00792427"/>
+  <w:style w:type="paragraph" w:customStyle="1" w:styleId="58039A3A86EA4DEB9C053B4706069F2B1">
+    <w:name w:val="58039A3A86EA4DEB9C053B4706069F2B1"/>
+    <w:rsid w:val="006B10F5"/>
     <w:pPr>
       <w:spacing w:after="120" w:line="360" w:lineRule="auto"/>
     </w:pPr>
@@ -3215,9 +3822,9 @@
       <w:szCs w:val="22"/>
     </w:rPr>
   </w:style>
-  <w:style w:type="paragraph" w:customStyle="1" w:styleId="994D7BA1863F4C78B7EE7927865E1143">
-    <w:name w:val="994D7BA1863F4C78B7EE7927865E1143"/>
-    <w:rsid w:val="00792427"/>
+  <w:style w:type="paragraph" w:customStyle="1" w:styleId="A2B922179FB34629AFC41165ECAD196E">
+    <w:name w:val="A2B922179FB34629AFC41165ECAD196E"/>
+    <w:rsid w:val="006B10F5"/>
     <w:pPr>
       <w:spacing w:after="120" w:line="360" w:lineRule="auto"/>
     </w:pPr>
@@ -3227,9 +3834,9 @@
       <w:szCs w:val="22"/>
     </w:rPr>
   </w:style>
-  <w:style w:type="paragraph" w:customStyle="1" w:styleId="86A13E55BF6A4AC2828AE3B1758ACEFB1">
-    <w:name w:val="86A13E55BF6A4AC2828AE3B1758ACEFB1"/>
-    <w:rsid w:val="00792427"/>
+  <w:style w:type="paragraph" w:customStyle="1" w:styleId="994D7BA1863F4C78B7EE7927865E1143">
+    <w:name w:val="994D7BA1863F4C78B7EE7927865E1143"/>
+    <w:rsid w:val="006B10F5"/>
     <w:pPr>
       <w:spacing w:after="120" w:line="360" w:lineRule="auto"/>
     </w:pPr>
@@ -3239,9 +3846,9 @@
       <w:szCs w:val="22"/>
     </w:rPr>
   </w:style>
-  <w:style w:type="paragraph" w:customStyle="1" w:styleId="E7101914D11D4BDC9DB6DE368C98B9691">
-    <w:name w:val="E7101914D11D4BDC9DB6DE368C98B9691"/>
-    <w:rsid w:val="00792427"/>
+  <w:style w:type="paragraph" w:customStyle="1" w:styleId="FC995E17A25344DD89C1B74E3BA63695">
+    <w:name w:val="FC995E17A25344DD89C1B74E3BA63695"/>
+    <w:rsid w:val="006B10F5"/>
     <w:pPr>
       <w:spacing w:after="120" w:line="360" w:lineRule="auto"/>
     </w:pPr>
@@ -3251,9 +3858,9 @@
       <w:szCs w:val="22"/>
     </w:rPr>
   </w:style>
-  <w:style w:type="paragraph" w:customStyle="1" w:styleId="5B6DF39B40544798AB737C73C03514381">
-    <w:name w:val="5B6DF39B40544798AB737C73C03514381"/>
-    <w:rsid w:val="00792427"/>
+  <w:style w:type="paragraph" w:customStyle="1" w:styleId="E7101914D11D4BDC9DB6DE368C98B9691">
+    <w:name w:val="E7101914D11D4BDC9DB6DE368C98B9691"/>
+    <w:rsid w:val="006B10F5"/>
     <w:pPr>
       <w:spacing w:after="120" w:line="360" w:lineRule="auto"/>
     </w:pPr>
@@ -3263,9 +3870,9 @@
       <w:szCs w:val="22"/>
     </w:rPr>
   </w:style>
-  <w:style w:type="paragraph" w:customStyle="1" w:styleId="4A3EB98DE1EB4BA6A2F51900886A6B331">
-    <w:name w:val="4A3EB98DE1EB4BA6A2F51900886A6B331"/>
-    <w:rsid w:val="00792427"/>
+  <w:style w:type="paragraph" w:customStyle="1" w:styleId="F574CC891E3447A7AB7DDA00E3B4A1A4">
+    <w:name w:val="F574CC891E3447A7AB7DDA00E3B4A1A4"/>
+    <w:rsid w:val="006B10F5"/>
     <w:pPr>
       <w:spacing w:after="120" w:line="360" w:lineRule="auto"/>
     </w:pPr>
@@ -3275,9 +3882,93 @@
       <w:szCs w:val="22"/>
     </w:rPr>
   </w:style>
+  <w:style w:type="paragraph" w:customStyle="1" w:styleId="5B6DF39B40544798AB737C73C03514381">
+    <w:name w:val="5B6DF39B40544798AB737C73C03514381"/>
+    <w:rsid w:val="006B10F5"/>
+    <w:pPr>
+      <w:spacing w:after="120" w:line="360" w:lineRule="auto"/>
+    </w:pPr>
+    <w:rPr>
+      <w:rFonts w:ascii="Times New Roman" w:eastAsiaTheme="minorHAnsi" w:hAnsi="Times New Roman"/>
+      <w:sz w:val="28"/>
+      <w:szCs w:val="22"/>
+    </w:rPr>
+  </w:style>
+  <w:style w:type="paragraph" w:customStyle="1" w:styleId="DCAD2F39CA904DCD868D2D248E804FAD">
+    <w:name w:val="DCAD2F39CA904DCD868D2D248E804FAD"/>
+    <w:rsid w:val="006B10F5"/>
+    <w:pPr>
+      <w:spacing w:after="120" w:line="360" w:lineRule="auto"/>
+    </w:pPr>
+    <w:rPr>
+      <w:rFonts w:ascii="Times New Roman" w:eastAsiaTheme="minorHAnsi" w:hAnsi="Times New Roman"/>
+      <w:sz w:val="28"/>
+      <w:szCs w:val="22"/>
+    </w:rPr>
+  </w:style>
+  <w:style w:type="paragraph" w:customStyle="1" w:styleId="285AE5B694214FC69829A8D4505B40D8">
+    <w:name w:val="285AE5B694214FC69829A8D4505B40D8"/>
+    <w:rsid w:val="006B10F5"/>
+    <w:pPr>
+      <w:spacing w:after="120" w:line="360" w:lineRule="auto"/>
+    </w:pPr>
+    <w:rPr>
+      <w:rFonts w:ascii="Times New Roman" w:eastAsiaTheme="minorHAnsi" w:hAnsi="Times New Roman"/>
+      <w:sz w:val="28"/>
+      <w:szCs w:val="22"/>
+    </w:rPr>
+  </w:style>
+  <w:style w:type="paragraph" w:customStyle="1" w:styleId="4A3EB98DE1EB4BA6A2F51900886A6B331">
+    <w:name w:val="4A3EB98DE1EB4BA6A2F51900886A6B331"/>
+    <w:rsid w:val="006B10F5"/>
+    <w:pPr>
+      <w:spacing w:after="120" w:line="360" w:lineRule="auto"/>
+    </w:pPr>
+    <w:rPr>
+      <w:rFonts w:ascii="Times New Roman" w:eastAsiaTheme="minorHAnsi" w:hAnsi="Times New Roman"/>
+      <w:sz w:val="28"/>
+      <w:szCs w:val="22"/>
+    </w:rPr>
+  </w:style>
+  <w:style w:type="paragraph" w:customStyle="1" w:styleId="88BE9ACDC932486EBB50CA6279B58D91">
+    <w:name w:val="88BE9ACDC932486EBB50CA6279B58D91"/>
+    <w:rsid w:val="006B10F5"/>
+    <w:pPr>
+      <w:spacing w:after="120" w:line="360" w:lineRule="auto"/>
+    </w:pPr>
+    <w:rPr>
+      <w:rFonts w:ascii="Times New Roman" w:eastAsiaTheme="minorHAnsi" w:hAnsi="Times New Roman"/>
+      <w:sz w:val="28"/>
+      <w:szCs w:val="22"/>
+    </w:rPr>
+  </w:style>
+  <w:style w:type="paragraph" w:customStyle="1" w:styleId="BBC4719731604384ACDF68D894BF47AC">
+    <w:name w:val="BBC4719731604384ACDF68D894BF47AC"/>
+    <w:rsid w:val="006B10F5"/>
+    <w:pPr>
+      <w:spacing w:after="120" w:line="360" w:lineRule="auto"/>
+    </w:pPr>
+    <w:rPr>
+      <w:rFonts w:ascii="Times New Roman" w:eastAsiaTheme="minorHAnsi" w:hAnsi="Times New Roman"/>
+      <w:sz w:val="28"/>
+      <w:szCs w:val="22"/>
+    </w:rPr>
+  </w:style>
+  <w:style w:type="paragraph" w:customStyle="1" w:styleId="4A967ADEA8C244D9A5469383FEEF7334">
+    <w:name w:val="4A967ADEA8C244D9A5469383FEEF7334"/>
+    <w:rsid w:val="006B10F5"/>
+    <w:pPr>
+      <w:spacing w:after="120" w:line="360" w:lineRule="auto"/>
+    </w:pPr>
+    <w:rPr>
+      <w:rFonts w:ascii="Times New Roman" w:eastAsiaTheme="minorHAnsi" w:hAnsi="Times New Roman"/>
+      <w:sz w:val="28"/>
+      <w:szCs w:val="22"/>
+    </w:rPr>
+  </w:style>
   <w:style w:type="paragraph" w:customStyle="1" w:styleId="1F3F82669AE341D18ABB707730240BB41">
     <w:name w:val="1F3F82669AE341D18ABB707730240BB41"/>
-    <w:rsid w:val="00792427"/>
+    <w:rsid w:val="006B10F5"/>
     <w:pPr>
       <w:spacing w:after="120" w:line="360" w:lineRule="auto"/>
     </w:pPr>

</xml_diff>